<commit_message>
Versiona la politica de privacidad y actualiza el manual a 1.2
- Incorpora al repositorio Politica_Privacidad_Confidencialidad_Controlia_v2.0.docx,
  la version vigente segun PRIVACY_VERSION de legal/constants.py.
- Manual de usuario 1.2 (aplicacion 2.2.0):
  - 1.5 lista las versiones vigentes de Terminos (v1.0) y Politica de
    Privacidad (v2.0) y explica que la aceptacion se registra por version.
  - Nueva seccion 3.3 "Acciones directas sobre un caso de la cola" con los
    botones Enviar email y Registrar gestion; Vista general pasa a 3.4.
  - Referencias cruzadas desde 6.3 y 6.6, y rutina del Ejecutivo actualizada.

Co-Authored-By: Claude Opus 5 <noreply@anthropic.com>
</commit_message>
<xml_diff>
--- a/outputs/Manual_Usuario_Controlia_Cobranzas.docx
+++ b/outputs/Manual_Usuario_Controlia_Cobranzas.docx
@@ -111,7 +111,7 @@
           <w:color w:val="1D4ED8"/>
           <w:sz w:val="20"/>
         </w:rPr>
-        <w:t>Versión del manual: 1.1  |  Agosto de 2026  |  Aplicación 2.1.0</w:t>
+        <w:t>Versión del manual: 1.2  |  Agosto de 2026  |  Aplicación 2.2.0</w:t>
       </w:r>
     </w:p>
     <w:p>
@@ -537,7 +537,7 @@
                 <w:color w:val="0F172A"/>
                 <w:sz w:val="18"/>
               </w:rPr>
-              <w:t>Indicadores, prioridades y filtros de trabajo.</w:t>
+              <w:t>Indicadores, prioridades, filtros y acciones directas sobre la cola.</w:t>
             </w:r>
           </w:p>
         </w:tc>
@@ -2428,6 +2428,280 @@
     <w:p>
       <w:r>
         <w:t>Cuando existe una versión nueva de los Términos y Condiciones o de la Política de Privacidad, se abre una ventana obligatoria. Lea ambas pestañas y pulse Aceptar y continuar. Si elige Salir, la aplicación se cerrará sin habilitar el trabajo.</w:t>
+      </w:r>
+    </w:p>
+    <w:tbl>
+      <w:tblPr>
+        <w:tblStyle w:val="TableGrid"/>
+        <w:tblW w:type="dxa" w:w="9360"/>
+        <w:jc w:val="left"/>
+        <w:tblLayout w:type="fixed"/>
+        <w:tblLook w:firstColumn="1" w:firstRow="1" w:lastColumn="0" w:lastRow="0" w:noHBand="0" w:noVBand="1" w:val="04A0"/>
+        <w:tblInd w:w="120" w:type="dxa"/>
+      </w:tblPr>
+      <w:tblGrid>
+        <w:gridCol w:w="3000"/>
+        <w:gridCol w:w="1700"/>
+        <w:gridCol w:w="4660"/>
+      </w:tblGrid>
+      <w:tr>
+        <w:trPr>
+          <w:tblHeader w:val="true"/>
+        </w:trPr>
+        <w:tc>
+          <w:tcPr>
+            <w:tcW w:type="dxa" w:w="3000"/>
+            <w:shd w:fill="2563EB"/>
+            <w:tcMar>
+              <w:top w:w="90" w:type="dxa"/>
+              <w:start w:w="120" w:type="dxa"/>
+              <w:bottom w:w="90" w:type="dxa"/>
+              <w:end w:w="120" w:type="dxa"/>
+            </w:tcMar>
+            <w:vAlign w:val="center"/>
+          </w:tcPr>
+          <w:p>
+            <w:pPr>
+              <w:spacing w:after="0"/>
+            </w:pPr>
+            <w:r>
+              <w:rPr>
+                <w:rFonts w:ascii="Segoe UI" w:hAnsi="Segoe UI"/>
+                <w:b/>
+                <w:color w:val="FFFFFF"/>
+                <w:sz w:val="17"/>
+              </w:rPr>
+              <w:t>Documento</w:t>
+            </w:r>
+          </w:p>
+        </w:tc>
+        <w:tc>
+          <w:tcPr>
+            <w:tcW w:type="dxa" w:w="1700"/>
+            <w:shd w:fill="2563EB"/>
+            <w:tcMar>
+              <w:top w:w="90" w:type="dxa"/>
+              <w:start w:w="120" w:type="dxa"/>
+              <w:bottom w:w="90" w:type="dxa"/>
+              <w:end w:w="120" w:type="dxa"/>
+            </w:tcMar>
+            <w:vAlign w:val="center"/>
+          </w:tcPr>
+          <w:p>
+            <w:pPr>
+              <w:spacing w:after="0"/>
+            </w:pPr>
+            <w:r>
+              <w:rPr>
+                <w:rFonts w:ascii="Segoe UI" w:hAnsi="Segoe UI"/>
+                <w:b/>
+                <w:color w:val="FFFFFF"/>
+                <w:sz w:val="17"/>
+              </w:rPr>
+              <w:t>Versión vigente</w:t>
+            </w:r>
+          </w:p>
+        </w:tc>
+        <w:tc>
+          <w:tcPr>
+            <w:tcW w:type="dxa" w:w="4660"/>
+            <w:shd w:fill="2563EB"/>
+            <w:tcMar>
+              <w:top w:w="90" w:type="dxa"/>
+              <w:start w:w="120" w:type="dxa"/>
+              <w:bottom w:w="90" w:type="dxa"/>
+              <w:end w:w="120" w:type="dxa"/>
+            </w:tcMar>
+            <w:vAlign w:val="center"/>
+          </w:tcPr>
+          <w:p>
+            <w:pPr>
+              <w:spacing w:after="0"/>
+            </w:pPr>
+            <w:r>
+              <w:rPr>
+                <w:rFonts w:ascii="Segoe UI" w:hAnsi="Segoe UI"/>
+                <w:b/>
+                <w:color w:val="FFFFFF"/>
+                <w:sz w:val="17"/>
+              </w:rPr>
+              <w:t>Dónde consultarlo</w:t>
+            </w:r>
+          </w:p>
+        </w:tc>
+      </w:tr>
+      <w:tr>
+        <w:trPr>
+          <w:cantSplit/>
+        </w:trPr>
+        <w:tc>
+          <w:tcPr>
+            <w:tcW w:type="dxa" w:w="3000"/>
+            <w:tcMar>
+              <w:top w:w="90" w:type="dxa"/>
+              <w:start w:w="120" w:type="dxa"/>
+              <w:bottom w:w="90" w:type="dxa"/>
+              <w:end w:w="120" w:type="dxa"/>
+            </w:tcMar>
+            <w:vAlign w:val="center"/>
+          </w:tcPr>
+          <w:p>
+            <w:pPr>
+              <w:spacing w:after="0"/>
+            </w:pPr>
+            <w:r>
+              <w:rPr>
+                <w:rFonts w:ascii="Segoe UI" w:hAnsi="Segoe UI"/>
+                <w:color w:val="0F172A"/>
+                <w:sz w:val="17"/>
+              </w:rPr>
+              <w:t>Términos y Condiciones</w:t>
+            </w:r>
+          </w:p>
+        </w:tc>
+        <w:tc>
+          <w:tcPr>
+            <w:tcW w:type="dxa" w:w="1700"/>
+            <w:tcMar>
+              <w:top w:w="90" w:type="dxa"/>
+              <w:start w:w="120" w:type="dxa"/>
+              <w:bottom w:w="90" w:type="dxa"/>
+              <w:end w:w="120" w:type="dxa"/>
+            </w:tcMar>
+            <w:vAlign w:val="center"/>
+          </w:tcPr>
+          <w:p>
+            <w:pPr>
+              <w:spacing w:after="0"/>
+            </w:pPr>
+            <w:r>
+              <w:rPr>
+                <w:rFonts w:ascii="Segoe UI" w:hAnsi="Segoe UI"/>
+                <w:color w:val="0F172A"/>
+                <w:sz w:val="17"/>
+              </w:rPr>
+              <w:t>v1.0</w:t>
+            </w:r>
+          </w:p>
+        </w:tc>
+        <w:tc>
+          <w:tcPr>
+            <w:tcW w:type="dxa" w:w="4660"/>
+            <w:tcMar>
+              <w:top w:w="90" w:type="dxa"/>
+              <w:start w:w="120" w:type="dxa"/>
+              <w:bottom w:w="90" w:type="dxa"/>
+              <w:end w:w="120" w:type="dxa"/>
+            </w:tcMar>
+            <w:vAlign w:val="center"/>
+          </w:tcPr>
+          <w:p>
+            <w:pPr>
+              <w:spacing w:after="0"/>
+            </w:pPr>
+            <w:r>
+              <w:rPr>
+                <w:rFonts w:ascii="Segoe UI" w:hAnsi="Segoe UI"/>
+                <w:color w:val="0F172A"/>
+                <w:sz w:val="17"/>
+              </w:rPr>
+              <w:t>Menú legal de la barra superior, en cualquier momento.</w:t>
+            </w:r>
+          </w:p>
+        </w:tc>
+      </w:tr>
+      <w:tr>
+        <w:trPr>
+          <w:cantSplit/>
+        </w:trPr>
+        <w:tc>
+          <w:tcPr>
+            <w:tcW w:type="dxa" w:w="3000"/>
+            <w:shd w:fill="F8FAFC"/>
+            <w:tcMar>
+              <w:top w:w="90" w:type="dxa"/>
+              <w:start w:w="120" w:type="dxa"/>
+              <w:bottom w:w="90" w:type="dxa"/>
+              <w:end w:w="120" w:type="dxa"/>
+            </w:tcMar>
+            <w:vAlign w:val="center"/>
+          </w:tcPr>
+          <w:p>
+            <w:pPr>
+              <w:spacing w:after="0"/>
+            </w:pPr>
+            <w:r>
+              <w:rPr>
+                <w:rFonts w:ascii="Segoe UI" w:hAnsi="Segoe UI"/>
+                <w:color w:val="0F172A"/>
+                <w:sz w:val="17"/>
+              </w:rPr>
+              <w:t>Política de Privacidad y Confidencialidad</w:t>
+            </w:r>
+          </w:p>
+        </w:tc>
+        <w:tc>
+          <w:tcPr>
+            <w:tcW w:type="dxa" w:w="1700"/>
+            <w:shd w:fill="F8FAFC"/>
+            <w:tcMar>
+              <w:top w:w="90" w:type="dxa"/>
+              <w:start w:w="120" w:type="dxa"/>
+              <w:bottom w:w="90" w:type="dxa"/>
+              <w:end w:w="120" w:type="dxa"/>
+            </w:tcMar>
+            <w:vAlign w:val="center"/>
+          </w:tcPr>
+          <w:p>
+            <w:pPr>
+              <w:spacing w:after="0"/>
+            </w:pPr>
+            <w:r>
+              <w:rPr>
+                <w:rFonts w:ascii="Segoe UI" w:hAnsi="Segoe UI"/>
+                <w:color w:val="0F172A"/>
+                <w:sz w:val="17"/>
+              </w:rPr>
+              <w:t>v2.0</w:t>
+            </w:r>
+          </w:p>
+        </w:tc>
+        <w:tc>
+          <w:tcPr>
+            <w:tcW w:type="dxa" w:w="4660"/>
+            <w:shd w:fill="F8FAFC"/>
+            <w:tcMar>
+              <w:top w:w="90" w:type="dxa"/>
+              <w:start w:w="120" w:type="dxa"/>
+              <w:bottom w:w="90" w:type="dxa"/>
+              <w:end w:w="120" w:type="dxa"/>
+            </w:tcMar>
+            <w:vAlign w:val="center"/>
+          </w:tcPr>
+          <w:p>
+            <w:pPr>
+              <w:spacing w:after="0"/>
+            </w:pPr>
+            <w:r>
+              <w:rPr>
+                <w:rFonts w:ascii="Segoe UI" w:hAnsi="Segoe UI"/>
+                <w:color w:val="0F172A"/>
+                <w:sz w:val="17"/>
+              </w:rPr>
+              <w:t>Menú legal y también durante la instalación, antes de instalar.</w:t>
+            </w:r>
+          </w:p>
+        </w:tc>
+      </w:tr>
+    </w:tbl>
+    <w:p>
+      <w:pPr>
+        <w:spacing w:after="20"/>
+      </w:pPr>
+    </w:p>
+    <w:p>
+      <w:r>
+        <w:t>La aceptación queda registrada con el usuario, la fecha y la versión del documento. Si se publica una versión posterior, la aplicación volverá a solicitar la aceptación aunque usted ya haya aceptado la anterior.</w:t>
       </w:r>
     </w:p>
     <w:p>
@@ -5119,7 +5393,7 @@
         <w:t xml:space="preserve">Abra el caso. </w:t>
       </w:r>
       <w:r>
-        <w:t>Use la acción disponible para acceder al detalle del deudor.</w:t>
+        <w:t>Haga clic sobre la fila para desplegar los datos de contacto y las acciones disponibles.</w:t>
       </w:r>
     </w:p>
     <w:p>
@@ -5154,7 +5428,480 @@
         <w:pStyle w:val="Heading2"/>
       </w:pPr>
       <w:r>
-        <w:t>3.3 Vista general</w:t>
+        <w:t>3.3 Acciones directas sobre un caso de la cola</w:t>
+      </w:r>
+    </w:p>
+    <w:p>
+      <w:r>
+        <w:t>Al hacer clic sobre una fila de la cola priorizada se despliegan el RUT, el último estado, el teléfono, el correo, la dirección y la cartera, junto con los botones de acción. Los botones de contacto aparecen solo cuando el deudor tiene ese canal disponible; Registrar gestión está siempre disponible.</w:t>
+      </w:r>
+    </w:p>
+    <w:tbl>
+      <w:tblPr>
+        <w:tblStyle w:val="TableGrid"/>
+        <w:tblW w:type="dxa" w:w="9360"/>
+        <w:jc w:val="left"/>
+        <w:tblLayout w:type="fixed"/>
+        <w:tblLook w:firstColumn="1" w:firstRow="1" w:lastColumn="0" w:lastRow="0" w:noHBand="0" w:noVBand="1" w:val="04A0"/>
+        <w:tblInd w:w="120" w:type="dxa"/>
+      </w:tblPr>
+      <w:tblGrid>
+        <w:gridCol w:w="2000"/>
+        <w:gridCol w:w="7360"/>
+      </w:tblGrid>
+      <w:tr>
+        <w:trPr>
+          <w:tblHeader w:val="true"/>
+        </w:trPr>
+        <w:tc>
+          <w:tcPr>
+            <w:tcW w:type="dxa" w:w="2000"/>
+            <w:shd w:fill="2563EB"/>
+            <w:tcMar>
+              <w:top w:w="90" w:type="dxa"/>
+              <w:start w:w="120" w:type="dxa"/>
+              <w:bottom w:w="90" w:type="dxa"/>
+              <w:end w:w="120" w:type="dxa"/>
+            </w:tcMar>
+            <w:vAlign w:val="center"/>
+          </w:tcPr>
+          <w:p>
+            <w:pPr>
+              <w:spacing w:after="0"/>
+            </w:pPr>
+            <w:r>
+              <w:rPr>
+                <w:rFonts w:ascii="Segoe UI" w:hAnsi="Segoe UI"/>
+                <w:b/>
+                <w:color w:val="FFFFFF"/>
+                <w:sz w:val="17"/>
+              </w:rPr>
+              <w:t>Botón</w:t>
+            </w:r>
+          </w:p>
+        </w:tc>
+        <w:tc>
+          <w:tcPr>
+            <w:tcW w:type="dxa" w:w="7360"/>
+            <w:shd w:fill="2563EB"/>
+            <w:tcMar>
+              <w:top w:w="90" w:type="dxa"/>
+              <w:start w:w="120" w:type="dxa"/>
+              <w:bottom w:w="90" w:type="dxa"/>
+              <w:end w:w="120" w:type="dxa"/>
+            </w:tcMar>
+            <w:vAlign w:val="center"/>
+          </w:tcPr>
+          <w:p>
+            <w:pPr>
+              <w:spacing w:after="0"/>
+            </w:pPr>
+            <w:r>
+              <w:rPr>
+                <w:rFonts w:ascii="Segoe UI" w:hAnsi="Segoe UI"/>
+                <w:b/>
+                <w:color w:val="FFFFFF"/>
+                <w:sz w:val="17"/>
+              </w:rPr>
+              <w:t>Qué hace</w:t>
+            </w:r>
+          </w:p>
+        </w:tc>
+      </w:tr>
+      <w:tr>
+        <w:trPr>
+          <w:cantSplit/>
+        </w:trPr>
+        <w:tc>
+          <w:tcPr>
+            <w:tcW w:type="dxa" w:w="2000"/>
+            <w:tcMar>
+              <w:top w:w="90" w:type="dxa"/>
+              <w:start w:w="120" w:type="dxa"/>
+              <w:bottom w:w="90" w:type="dxa"/>
+              <w:end w:w="120" w:type="dxa"/>
+            </w:tcMar>
+            <w:vAlign w:val="center"/>
+          </w:tcPr>
+          <w:p>
+            <w:pPr>
+              <w:spacing w:after="0"/>
+            </w:pPr>
+            <w:r>
+              <w:rPr>
+                <w:rFonts w:ascii="Segoe UI" w:hAnsi="Segoe UI"/>
+                <w:color w:val="0F172A"/>
+                <w:sz w:val="17"/>
+              </w:rPr>
+              <w:t>Enviar email</w:t>
+            </w:r>
+          </w:p>
+        </w:tc>
+        <w:tc>
+          <w:tcPr>
+            <w:tcW w:type="dxa" w:w="7360"/>
+            <w:tcMar>
+              <w:top w:w="90" w:type="dxa"/>
+              <w:start w:w="120" w:type="dxa"/>
+              <w:bottom w:w="90" w:type="dxa"/>
+              <w:end w:w="120" w:type="dxa"/>
+            </w:tcMar>
+            <w:vAlign w:val="center"/>
+          </w:tcPr>
+          <w:p>
+            <w:pPr>
+              <w:spacing w:after="0"/>
+            </w:pPr>
+            <w:r>
+              <w:rPr>
+                <w:rFonts w:ascii="Segoe UI" w:hAnsi="Segoe UI"/>
+                <w:color w:val="0F172A"/>
+                <w:sz w:val="17"/>
+              </w:rPr>
+              <w:t>Abre la ventana Correo al deudor, con las mismas opciones que la ficha del deudor: plantilla, tipo de envío, trabajador/licencia, vista previa, envío de correo y envío por WhatsApp.</w:t>
+            </w:r>
+          </w:p>
+        </w:tc>
+      </w:tr>
+      <w:tr>
+        <w:trPr>
+          <w:cantSplit/>
+        </w:trPr>
+        <w:tc>
+          <w:tcPr>
+            <w:tcW w:type="dxa" w:w="2000"/>
+            <w:shd w:fill="F8FAFC"/>
+            <w:tcMar>
+              <w:top w:w="90" w:type="dxa"/>
+              <w:start w:w="120" w:type="dxa"/>
+              <w:bottom w:w="90" w:type="dxa"/>
+              <w:end w:w="120" w:type="dxa"/>
+            </w:tcMar>
+            <w:vAlign w:val="center"/>
+          </w:tcPr>
+          <w:p>
+            <w:pPr>
+              <w:spacing w:after="0"/>
+            </w:pPr>
+            <w:r>
+              <w:rPr>
+                <w:rFonts w:ascii="Segoe UI" w:hAnsi="Segoe UI"/>
+                <w:color w:val="0F172A"/>
+                <w:sz w:val="17"/>
+              </w:rPr>
+              <w:t>Registrar gestión</w:t>
+            </w:r>
+          </w:p>
+        </w:tc>
+        <w:tc>
+          <w:tcPr>
+            <w:tcW w:type="dxa" w:w="7360"/>
+            <w:shd w:fill="F8FAFC"/>
+            <w:tcMar>
+              <w:top w:w="90" w:type="dxa"/>
+              <w:start w:w="120" w:type="dxa"/>
+              <w:bottom w:w="90" w:type="dxa"/>
+              <w:end w:w="120" w:type="dxa"/>
+            </w:tcMar>
+            <w:vAlign w:val="center"/>
+          </w:tcPr>
+          <w:p>
+            <w:pPr>
+              <w:spacing w:after="0"/>
+            </w:pPr>
+            <w:r>
+              <w:rPr>
+                <w:rFonts w:ascii="Segoe UI" w:hAnsi="Segoe UI"/>
+                <w:color w:val="0F172A"/>
+                <w:sz w:val="17"/>
+              </w:rPr>
+              <w:t>Abre el formulario Agregar gestión manual del deudor: tipo, estado, fecha y observación.</w:t>
+            </w:r>
+          </w:p>
+        </w:tc>
+      </w:tr>
+      <w:tr>
+        <w:trPr>
+          <w:cantSplit/>
+        </w:trPr>
+        <w:tc>
+          <w:tcPr>
+            <w:tcW w:type="dxa" w:w="2000"/>
+            <w:tcMar>
+              <w:top w:w="90" w:type="dxa"/>
+              <w:start w:w="120" w:type="dxa"/>
+              <w:bottom w:w="90" w:type="dxa"/>
+              <w:end w:w="120" w:type="dxa"/>
+            </w:tcMar>
+            <w:vAlign w:val="center"/>
+          </w:tcPr>
+          <w:p>
+            <w:pPr>
+              <w:spacing w:after="0"/>
+            </w:pPr>
+            <w:r>
+              <w:rPr>
+                <w:rFonts w:ascii="Segoe UI" w:hAnsi="Segoe UI"/>
+                <w:color w:val="0F172A"/>
+                <w:sz w:val="17"/>
+              </w:rPr>
+              <w:t>Llamar / Generar carta</w:t>
+            </w:r>
+          </w:p>
+        </w:tc>
+        <w:tc>
+          <w:tcPr>
+            <w:tcW w:type="dxa" w:w="7360"/>
+            <w:tcMar>
+              <w:top w:w="90" w:type="dxa"/>
+              <w:start w:w="120" w:type="dxa"/>
+              <w:bottom w:w="90" w:type="dxa"/>
+              <w:end w:w="120" w:type="dxa"/>
+            </w:tcMar>
+            <w:vAlign w:val="center"/>
+          </w:tcPr>
+          <w:p>
+            <w:pPr>
+              <w:spacing w:after="0"/>
+            </w:pPr>
+            <w:r>
+              <w:rPr>
+                <w:rFonts w:ascii="Segoe UI" w:hAnsi="Segoe UI"/>
+                <w:color w:val="0F172A"/>
+                <w:sz w:val="17"/>
+              </w:rPr>
+              <w:t>Muestran un aviso con el caso seleccionado. El teléfono y la dirección para trabajarlos fuera de la aplicación están en el detalle desplegado de la fila.</w:t>
+            </w:r>
+          </w:p>
+        </w:tc>
+      </w:tr>
+    </w:tbl>
+    <w:p>
+      <w:pPr>
+        <w:spacing w:after="20"/>
+      </w:pPr>
+    </w:p>
+    <w:p>
+      <w:pPr>
+        <w:pStyle w:val="Heading3"/>
+      </w:pPr>
+      <w:r>
+        <w:t>Enviar un correo desde la cola</w:t>
+      </w:r>
+    </w:p>
+    <w:p>
+      <w:pPr>
+        <w:spacing w:after="100"/>
+        <w:ind w:left="461" w:hanging="461"/>
+      </w:pPr>
+      <w:r>
+        <w:rPr>
+          <w:rFonts w:ascii="Segoe UI" w:hAnsi="Segoe UI"/>
+          <w:b/>
+          <w:color w:val="1D4ED8"/>
+          <w:sz w:val="20"/>
+        </w:rPr>
+        <w:t xml:space="preserve">1. </w:t>
+      </w:r>
+      <w:r>
+        <w:rPr>
+          <w:rFonts w:ascii="Segoe UI" w:hAnsi="Segoe UI"/>
+          <w:b/>
+          <w:color w:val="0F172A"/>
+          <w:sz w:val="20"/>
+        </w:rPr>
+        <w:t xml:space="preserve">Pulse Enviar email. </w:t>
+      </w:r>
+      <w:r>
+        <w:t>Se abre Correo al deudor con el nombre, el RUT y los expedientes del caso.</w:t>
+      </w:r>
+    </w:p>
+    <w:p>
+      <w:pPr>
+        <w:spacing w:after="100"/>
+        <w:ind w:left="461" w:hanging="461"/>
+      </w:pPr>
+      <w:r>
+        <w:rPr>
+          <w:rFonts w:ascii="Segoe UI" w:hAnsi="Segoe UI"/>
+          <w:b/>
+          <w:color w:val="1D4ED8"/>
+          <w:sz w:val="20"/>
+        </w:rPr>
+        <w:t xml:space="preserve">2. </w:t>
+      </w:r>
+      <w:r>
+        <w:rPr>
+          <w:rFonts w:ascii="Segoe UI" w:hAnsi="Segoe UI"/>
+          <w:b/>
+          <w:color w:val="0F172A"/>
+          <w:sz w:val="20"/>
+        </w:rPr>
+        <w:t xml:space="preserve">Seleccione plantilla y tipo de envío. </w:t>
+      </w:r>
+      <w:r>
+        <w:t>Individual usa un trabajador/licencia; Consolidado reúne todas las licencias del deudor.</w:t>
+      </w:r>
+    </w:p>
+    <w:p>
+      <w:pPr>
+        <w:spacing w:after="100"/>
+        <w:ind w:left="461" w:hanging="461"/>
+      </w:pPr>
+      <w:r>
+        <w:rPr>
+          <w:rFonts w:ascii="Segoe UI" w:hAnsi="Segoe UI"/>
+          <w:b/>
+          <w:color w:val="1D4ED8"/>
+          <w:sz w:val="20"/>
+        </w:rPr>
+        <w:t xml:space="preserve">3. </w:t>
+      </w:r>
+      <w:r>
+        <w:rPr>
+          <w:rFonts w:ascii="Segoe UI" w:hAnsi="Segoe UI"/>
+          <w:b/>
+          <w:color w:val="0F172A"/>
+          <w:sz w:val="20"/>
+        </w:rPr>
+        <w:t xml:space="preserve">Revise el destino. </w:t>
+      </w:r>
+      <w:r>
+        <w:t>Si aparece Sin correo disponible, corrija los datos del cliente antes de continuar.</w:t>
+      </w:r>
+    </w:p>
+    <w:p>
+      <w:pPr>
+        <w:spacing w:after="100"/>
+        <w:ind w:left="461" w:hanging="461"/>
+      </w:pPr>
+      <w:r>
+        <w:rPr>
+          <w:rFonts w:ascii="Segoe UI" w:hAnsi="Segoe UI"/>
+          <w:b/>
+          <w:color w:val="1D4ED8"/>
+          <w:sz w:val="20"/>
+        </w:rPr>
+        <w:t xml:space="preserve">4. </w:t>
+      </w:r>
+      <w:r>
+        <w:rPr>
+          <w:rFonts w:ascii="Segoe UI" w:hAnsi="Segoe UI"/>
+          <w:b/>
+          <w:color w:val="0F172A"/>
+          <w:sz w:val="20"/>
+        </w:rPr>
+        <w:t xml:space="preserve">Use Vista previa. </w:t>
+      </w:r>
+      <w:r>
+        <w:t>Confirme Para, Asunto y el detalle antes de enviar.</w:t>
+      </w:r>
+    </w:p>
+    <w:p>
+      <w:pPr>
+        <w:spacing w:after="100"/>
+        <w:ind w:left="461" w:hanging="461"/>
+      </w:pPr>
+      <w:r>
+        <w:rPr>
+          <w:rFonts w:ascii="Segoe UI" w:hAnsi="Segoe UI"/>
+          <w:b/>
+          <w:color w:val="1D4ED8"/>
+          <w:sz w:val="20"/>
+        </w:rPr>
+        <w:t xml:space="preserve">5. </w:t>
+      </w:r>
+      <w:r>
+        <w:rPr>
+          <w:rFonts w:ascii="Segoe UI" w:hAnsi="Segoe UI"/>
+          <w:b/>
+          <w:color w:val="0F172A"/>
+          <w:sz w:val="20"/>
+        </w:rPr>
+        <w:t xml:space="preserve">Pulse Enviar email. </w:t>
+      </w:r>
+      <w:r>
+        <w:t>Si la sesión SMTP no está activa, la aplicación solicita únicamente la contraseña del servidor.</w:t>
+      </w:r>
+    </w:p>
+    <w:p>
+      <w:r>
+        <w:t>El envío queda registrado automáticamente como gestión Email / Enviado y la cola se recalcula al cerrar la ventana. Los detalles de plantillas, variables y resultados están en el capítulo 6.</w:t>
+      </w:r>
+    </w:p>
+    <w:p>
+      <w:pPr>
+        <w:pStyle w:val="Heading3"/>
+      </w:pPr>
+      <w:r>
+        <w:t>Registrar una gestión desde la cola</w:t>
+      </w:r>
+    </w:p>
+    <w:p>
+      <w:r>
+        <w:t>El botón Registrar gestión abre exactamente el mismo formulario descrito en la sección 6.3, con Tipo, Estado, Fecha y Observación. Al guardar, la prioridad y la antigüedad del caso se actualizan en la cola.</w:t>
+      </w:r>
+    </w:p>
+    <w:tbl>
+      <w:tblPr>
+        <w:tblW w:type="dxa" w:w="9360"/>
+        <w:jc w:val="left"/>
+        <w:tblLayout w:type="fixed"/>
+        <w:tblLook w:firstColumn="1" w:firstRow="1" w:lastColumn="0" w:lastRow="0" w:noHBand="0" w:noVBand="1" w:val="04A0"/>
+        <w:tblInd w:w="120" w:type="dxa"/>
+      </w:tblPr>
+      <w:tblGrid>
+        <w:gridCol w:w="9360"/>
+      </w:tblGrid>
+      <w:tr>
+        <w:tc>
+          <w:tcPr>
+            <w:tcW w:type="dxa" w:w="9360"/>
+            <w:tcMar>
+              <w:top w:w="90" w:type="dxa"/>
+              <w:start w:w="120" w:type="dxa"/>
+              <w:bottom w:w="90" w:type="dxa"/>
+              <w:end w:w="120" w:type="dxa"/>
+            </w:tcMar>
+            <w:vAlign w:val="center"/>
+            <w:shd w:fill="FFF7ED"/>
+          </w:tcPr>
+          <w:p>
+            <w:pPr>
+              <w:spacing w:after="0"/>
+            </w:pPr>
+            <w:r>
+              <w:rPr>
+                <w:rFonts w:ascii="Segoe UI" w:hAnsi="Segoe UI"/>
+                <w:b/>
+                <w:color w:val="B45309"/>
+                <w:sz w:val="19"/>
+              </w:rPr>
+              <w:t xml:space="preserve">CARTERA NO ASIGNADA  </w:t>
+            </w:r>
+            <w:r>
+              <w:rPr>
+                <w:rFonts w:ascii="Segoe UI" w:hAnsi="Segoe UI"/>
+                <w:color w:val="0F172A"/>
+                <w:sz w:val="19"/>
+              </w:rPr>
+              <w:t>Si la cartera del deudor no está asignada a su usuario, dentro de la ventana Correo al deudor los botones de vista previa y envío aparecen deshabilitados con el aviso Bloqueado: cartera no asignada a tu usuario. En ese caso use Asignar tarea desde la ficha del deudor para derivar el caso a la ejecutiva responsable.</w:t>
+            </w:r>
+          </w:p>
+        </w:tc>
+      </w:tr>
+    </w:tbl>
+    <w:p>
+      <w:pPr>
+        <w:spacing w:after="0"/>
+      </w:pPr>
+    </w:p>
+    <w:p>
+      <w:pPr>
+        <w:pStyle w:val="Heading2"/>
+      </w:pPr>
+      <w:r>
+        <w:t>3.4 Vista general</w:t>
       </w:r>
     </w:p>
     <w:tbl>
@@ -7841,6 +8588,11 @@
       </w:r>
     </w:p>
     <w:p>
+      <w:r>
+        <w:t>Este mismo formulario se abre con el botón Registrar gestión de la cola priorizada del Dashboard, descrito en la sección 3.3.</w:t>
+      </w:r>
+    </w:p>
+    <w:p>
       <w:pPr>
         <w:spacing w:after="100"/>
         <w:ind w:left="461" w:hanging="461"/>
@@ -8285,6 +9037,11 @@
       </w:pPr>
       <w:r>
         <w:t>6.6 Vista previa y envío de correo individual</w:t>
+      </w:r>
+    </w:p>
+    <w:p>
+      <w:r>
+        <w:t>Estas mismas opciones están disponibles sin abrir la ficha, con el botón Enviar email de la cola priorizada del Dashboard (sección 3.3).</w:t>
       </w:r>
     </w:p>
     <w:p>
@@ -12357,7 +13114,7 @@
                 <w:color w:val="0F172A"/>
                 <w:sz w:val="16"/>
               </w:rPr>
-              <w:t>Abrir deudor, verificar identidad y datos de contacto; realizar la acción.</w:t>
+              <w:t>Desplegar el caso en la cola y usar Enviar email o Registrar gestión; abrir la ficha del deudor cuando se necesite el detalle completo.</w:t>
             </w:r>
           </w:p>
         </w:tc>

</xml_diff>

<commit_message>
Actualiza el manual a 1.3 con las comisiones por cartera
Documenta la tarjeta "Mis comisiones acumuladas" en Mi trabajo, la nueva
seccion "Comisiones por ejecutiva" del supervisor con su corte a $0, y la
tabla de porcentajes dentro de "Asignacion de carteras".

Quita del capitulo 3 la fila "Salud operativa", que ya no existe en la
pestana Mi trabajo, y agrega los casos de comisiones al capitulo de
solucion de problemas y al glosario.

Co-Authored-By: Claude Opus 5 <noreply@anthropic.com>
</commit_message>
<xml_diff>
--- a/outputs/Manual_Usuario_Controlia_Cobranzas.docx
+++ b/outputs/Manual_Usuario_Controlia_Cobranzas.docx
@@ -111,7 +111,7 @@
           <w:color w:val="1D4ED8"/>
           <w:sz w:val="20"/>
         </w:rPr>
-        <w:t>Versión del manual: 1.2  |  Agosto de 2026  |  Aplicación 2.2.0</w:t>
+        <w:t>Versión del manual: 1.3  |  Agosto de 2026  |  Aplicación 2.2.0</w:t>
       </w:r>
     </w:p>
     <w:p>
@@ -537,7 +537,7 @@
                 <w:color w:val="0F172A"/>
                 <w:sz w:val="18"/>
               </w:rPr>
-              <w:t>Indicadores, prioridades, filtros y acciones directas sobre la cola.</w:t>
+              <w:t>Indicadores, comisiones, prioridades, filtros y acciones directas sobre la cola.</w:t>
             </w:r>
           </w:p>
         </w:tc>
@@ -946,7 +946,7 @@
                 <w:color w:val="0F172A"/>
                 <w:sz w:val="18"/>
               </w:rPr>
-              <w:t>Asignaciones, reemplazos y limpiezas.</w:t>
+              <w:t>Asignaciones, porcentajes de comisión, reemplazos y limpiezas.</w:t>
             </w:r>
           </w:p>
         </w:tc>
@@ -3432,7 +3432,7 @@
                 <w:color w:val="0F172A"/>
                 <w:sz w:val="16"/>
               </w:rPr>
-              <w:t>Conciliación de Nóminas</w:t>
+              <w:t>Ver su propia comisión acumulada</w:t>
             </w:r>
           </w:p>
         </w:tc>
@@ -3458,7 +3458,7 @@
                 <w:color w:val="0F172A"/>
                 <w:sz w:val="16"/>
               </w:rPr>
-              <w:t>Sí</w:t>
+              <w:t>No aplica</w:t>
             </w:r>
           </w:p>
         </w:tc>
@@ -3484,7 +3484,7 @@
                 <w:color w:val="0F172A"/>
                 <w:sz w:val="16"/>
               </w:rPr>
-              <w:t>Sí</w:t>
+              <w:t>No aplica</w:t>
             </w:r>
           </w:p>
         </w:tc>
@@ -3510,7 +3510,7 @@
                 <w:color w:val="0F172A"/>
                 <w:sz w:val="16"/>
               </w:rPr>
-              <w:t>No</w:t>
+              <w:t>Sí, solo la suya</w:t>
             </w:r>
           </w:p>
         </w:tc>
@@ -3540,7 +3540,7 @@
                 <w:color w:val="0F172A"/>
                 <w:sz w:val="16"/>
               </w:rPr>
-              <w:t>Búsqueda de Deudores</w:t>
+              <w:t>Ver las comisiones de todas las ejecutivas</w:t>
             </w:r>
           </w:p>
         </w:tc>
@@ -3615,7 +3615,7 @@
                 <w:color w:val="0F172A"/>
                 <w:sz w:val="16"/>
               </w:rPr>
-              <w:t>Consulta todas; opera solo las asignadas</w:t>
+              <w:t>No</w:t>
             </w:r>
           </w:p>
         </w:tc>
@@ -3646,7 +3646,7 @@
                 <w:color w:val="0F172A"/>
                 <w:sz w:val="16"/>
               </w:rPr>
-              <w:t>Cargar base de deudores</w:t>
+              <w:t>Definir el porcentaje de comisión por cartera</w:t>
             </w:r>
           </w:p>
         </w:tc>
@@ -3754,7 +3754,7 @@
                 <w:color w:val="0F172A"/>
                 <w:sz w:val="16"/>
               </w:rPr>
-              <w:t>Cargar / exportar gestiones</w:t>
+              <w:t>Reestablecer las comisiones a $0</w:t>
             </w:r>
           </w:p>
         </w:tc>
@@ -3860,7 +3860,7 @@
                 <w:color w:val="0F172A"/>
                 <w:sz w:val="16"/>
               </w:rPr>
-              <w:t>Envíos: Configuración SMTP</w:t>
+              <w:t>Conciliación de Nóminas</w:t>
             </w:r>
           </w:p>
         </w:tc>
@@ -3938,7 +3938,7 @@
                 <w:color w:val="0F172A"/>
                 <w:sz w:val="16"/>
               </w:rPr>
-              <w:t>Sí</w:t>
+              <w:t>No</w:t>
             </w:r>
           </w:p>
         </w:tc>
@@ -3968,7 +3968,7 @@
                 <w:color w:val="0F172A"/>
                 <w:sz w:val="16"/>
               </w:rPr>
-              <w:t>Envíos: Plantillas</w:t>
+              <w:t>Búsqueda de Deudores</w:t>
             </w:r>
           </w:p>
         </w:tc>
@@ -4043,7 +4043,7 @@
                 <w:color w:val="0F172A"/>
                 <w:sz w:val="16"/>
               </w:rPr>
-              <w:t>Sí</w:t>
+              <w:t>Consulta todas; opera solo las asignadas</w:t>
             </w:r>
           </w:p>
         </w:tc>
@@ -4074,7 +4074,7 @@
                 <w:color w:val="0F172A"/>
                 <w:sz w:val="16"/>
               </w:rPr>
-              <w:t>Envío masivo</w:t>
+              <w:t>Cargar base de deudores</w:t>
             </w:r>
           </w:p>
         </w:tc>
@@ -4100,7 +4100,7 @@
                 <w:color w:val="0F172A"/>
                 <w:sz w:val="16"/>
               </w:rPr>
-              <w:t>No visible</w:t>
+              <w:t>Sí</w:t>
             </w:r>
           </w:p>
         </w:tc>
@@ -4152,7 +4152,7 @@
                 <w:color w:val="0F172A"/>
                 <w:sz w:val="16"/>
               </w:rPr>
-              <w:t>No visible</w:t>
+              <w:t>No</w:t>
             </w:r>
           </w:p>
         </w:tc>
@@ -4182,7 +4182,7 @@
                 <w:color w:val="0F172A"/>
                 <w:sz w:val="16"/>
               </w:rPr>
-              <w:t>Administración de carteras</w:t>
+              <w:t>Cargar / exportar gestiones</w:t>
             </w:r>
           </w:p>
         </w:tc>
@@ -4288,7 +4288,7 @@
                 <w:color w:val="0F172A"/>
                 <w:sz w:val="16"/>
               </w:rPr>
-              <w:t>Gestión de usuarios</w:t>
+              <w:t>Envíos: Configuración SMTP</w:t>
             </w:r>
           </w:p>
         </w:tc>
@@ -4340,7 +4340,7 @@
                 <w:color w:val="0F172A"/>
                 <w:sz w:val="16"/>
               </w:rPr>
-              <w:t>No</w:t>
+              <w:t>Sí</w:t>
             </w:r>
           </w:p>
         </w:tc>
@@ -4366,7 +4366,7 @@
                 <w:color w:val="0F172A"/>
                 <w:sz w:val="16"/>
               </w:rPr>
-              <w:t>No</w:t>
+              <w:t>Sí</w:t>
             </w:r>
           </w:p>
         </w:tc>
@@ -4396,6 +4396,434 @@
                 <w:color w:val="0F172A"/>
                 <w:sz w:val="16"/>
               </w:rPr>
+              <w:t>Envíos: Plantillas</w:t>
+            </w:r>
+          </w:p>
+        </w:tc>
+        <w:tc>
+          <w:tcPr>
+            <w:tcW w:type="dxa" w:w="1900"/>
+            <w:tcMar>
+              <w:top w:w="90" w:type="dxa"/>
+              <w:start w:w="120" w:type="dxa"/>
+              <w:bottom w:w="90" w:type="dxa"/>
+              <w:end w:w="120" w:type="dxa"/>
+            </w:tcMar>
+            <w:vAlign w:val="center"/>
+          </w:tcPr>
+          <w:p>
+            <w:pPr>
+              <w:spacing w:after="0"/>
+            </w:pPr>
+            <w:r>
+              <w:rPr>
+                <w:rFonts w:ascii="Segoe UI" w:hAnsi="Segoe UI"/>
+                <w:color w:val="0F172A"/>
+                <w:sz w:val="16"/>
+              </w:rPr>
+              <w:t>Sí</w:t>
+            </w:r>
+          </w:p>
+        </w:tc>
+        <w:tc>
+          <w:tcPr>
+            <w:tcW w:type="dxa" w:w="1900"/>
+            <w:tcMar>
+              <w:top w:w="90" w:type="dxa"/>
+              <w:start w:w="120" w:type="dxa"/>
+              <w:bottom w:w="90" w:type="dxa"/>
+              <w:end w:w="120" w:type="dxa"/>
+            </w:tcMar>
+            <w:vAlign w:val="center"/>
+          </w:tcPr>
+          <w:p>
+            <w:pPr>
+              <w:spacing w:after="0"/>
+            </w:pPr>
+            <w:r>
+              <w:rPr>
+                <w:rFonts w:ascii="Segoe UI" w:hAnsi="Segoe UI"/>
+                <w:color w:val="0F172A"/>
+                <w:sz w:val="16"/>
+              </w:rPr>
+              <w:t>Sí</w:t>
+            </w:r>
+          </w:p>
+        </w:tc>
+        <w:tc>
+          <w:tcPr>
+            <w:tcW w:type="dxa" w:w="1900"/>
+            <w:tcMar>
+              <w:top w:w="90" w:type="dxa"/>
+              <w:start w:w="120" w:type="dxa"/>
+              <w:bottom w:w="90" w:type="dxa"/>
+              <w:end w:w="120" w:type="dxa"/>
+            </w:tcMar>
+            <w:vAlign w:val="center"/>
+          </w:tcPr>
+          <w:p>
+            <w:pPr>
+              <w:spacing w:after="0"/>
+            </w:pPr>
+            <w:r>
+              <w:rPr>
+                <w:rFonts w:ascii="Segoe UI" w:hAnsi="Segoe UI"/>
+                <w:color w:val="0F172A"/>
+                <w:sz w:val="16"/>
+              </w:rPr>
+              <w:t>Sí</w:t>
+            </w:r>
+          </w:p>
+        </w:tc>
+      </w:tr>
+      <w:tr>
+        <w:trPr>
+          <w:cantSplit/>
+        </w:trPr>
+        <w:tc>
+          <w:tcPr>
+            <w:tcW w:type="dxa" w:w="3660"/>
+            <w:shd w:fill="F8FAFC"/>
+            <w:tcMar>
+              <w:top w:w="90" w:type="dxa"/>
+              <w:start w:w="120" w:type="dxa"/>
+              <w:bottom w:w="90" w:type="dxa"/>
+              <w:end w:w="120" w:type="dxa"/>
+            </w:tcMar>
+            <w:vAlign w:val="center"/>
+          </w:tcPr>
+          <w:p>
+            <w:pPr>
+              <w:spacing w:after="0"/>
+            </w:pPr>
+            <w:r>
+              <w:rPr>
+                <w:rFonts w:ascii="Segoe UI" w:hAnsi="Segoe UI"/>
+                <w:color w:val="0F172A"/>
+                <w:sz w:val="16"/>
+              </w:rPr>
+              <w:t>Envío masivo</w:t>
+            </w:r>
+          </w:p>
+        </w:tc>
+        <w:tc>
+          <w:tcPr>
+            <w:tcW w:type="dxa" w:w="1900"/>
+            <w:shd w:fill="F8FAFC"/>
+            <w:tcMar>
+              <w:top w:w="90" w:type="dxa"/>
+              <w:start w:w="120" w:type="dxa"/>
+              <w:bottom w:w="90" w:type="dxa"/>
+              <w:end w:w="120" w:type="dxa"/>
+            </w:tcMar>
+            <w:vAlign w:val="center"/>
+          </w:tcPr>
+          <w:p>
+            <w:pPr>
+              <w:spacing w:after="0"/>
+            </w:pPr>
+            <w:r>
+              <w:rPr>
+                <w:rFonts w:ascii="Segoe UI" w:hAnsi="Segoe UI"/>
+                <w:color w:val="0F172A"/>
+                <w:sz w:val="16"/>
+              </w:rPr>
+              <w:t>No visible</w:t>
+            </w:r>
+          </w:p>
+        </w:tc>
+        <w:tc>
+          <w:tcPr>
+            <w:tcW w:type="dxa" w:w="1900"/>
+            <w:shd w:fill="F8FAFC"/>
+            <w:tcMar>
+              <w:top w:w="90" w:type="dxa"/>
+              <w:start w:w="120" w:type="dxa"/>
+              <w:bottom w:w="90" w:type="dxa"/>
+              <w:end w:w="120" w:type="dxa"/>
+            </w:tcMar>
+            <w:vAlign w:val="center"/>
+          </w:tcPr>
+          <w:p>
+            <w:pPr>
+              <w:spacing w:after="0"/>
+            </w:pPr>
+            <w:r>
+              <w:rPr>
+                <w:rFonts w:ascii="Segoe UI" w:hAnsi="Segoe UI"/>
+                <w:color w:val="0F172A"/>
+                <w:sz w:val="16"/>
+              </w:rPr>
+              <w:t>Sí</w:t>
+            </w:r>
+          </w:p>
+        </w:tc>
+        <w:tc>
+          <w:tcPr>
+            <w:tcW w:type="dxa" w:w="1900"/>
+            <w:shd w:fill="F8FAFC"/>
+            <w:tcMar>
+              <w:top w:w="90" w:type="dxa"/>
+              <w:start w:w="120" w:type="dxa"/>
+              <w:bottom w:w="90" w:type="dxa"/>
+              <w:end w:w="120" w:type="dxa"/>
+            </w:tcMar>
+            <w:vAlign w:val="center"/>
+          </w:tcPr>
+          <w:p>
+            <w:pPr>
+              <w:spacing w:after="0"/>
+            </w:pPr>
+            <w:r>
+              <w:rPr>
+                <w:rFonts w:ascii="Segoe UI" w:hAnsi="Segoe UI"/>
+                <w:color w:val="0F172A"/>
+                <w:sz w:val="16"/>
+              </w:rPr>
+              <w:t>No visible</w:t>
+            </w:r>
+          </w:p>
+        </w:tc>
+      </w:tr>
+      <w:tr>
+        <w:trPr>
+          <w:cantSplit/>
+        </w:trPr>
+        <w:tc>
+          <w:tcPr>
+            <w:tcW w:type="dxa" w:w="3660"/>
+            <w:tcMar>
+              <w:top w:w="90" w:type="dxa"/>
+              <w:start w:w="120" w:type="dxa"/>
+              <w:bottom w:w="90" w:type="dxa"/>
+              <w:end w:w="120" w:type="dxa"/>
+            </w:tcMar>
+            <w:vAlign w:val="center"/>
+          </w:tcPr>
+          <w:p>
+            <w:pPr>
+              <w:spacing w:after="0"/>
+            </w:pPr>
+            <w:r>
+              <w:rPr>
+                <w:rFonts w:ascii="Segoe UI" w:hAnsi="Segoe UI"/>
+                <w:color w:val="0F172A"/>
+                <w:sz w:val="16"/>
+              </w:rPr>
+              <w:t>Administración de carteras</w:t>
+            </w:r>
+          </w:p>
+        </w:tc>
+        <w:tc>
+          <w:tcPr>
+            <w:tcW w:type="dxa" w:w="1900"/>
+            <w:tcMar>
+              <w:top w:w="90" w:type="dxa"/>
+              <w:start w:w="120" w:type="dxa"/>
+              <w:bottom w:w="90" w:type="dxa"/>
+              <w:end w:w="120" w:type="dxa"/>
+            </w:tcMar>
+            <w:vAlign w:val="center"/>
+          </w:tcPr>
+          <w:p>
+            <w:pPr>
+              <w:spacing w:after="0"/>
+            </w:pPr>
+            <w:r>
+              <w:rPr>
+                <w:rFonts w:ascii="Segoe UI" w:hAnsi="Segoe UI"/>
+                <w:color w:val="0F172A"/>
+                <w:sz w:val="16"/>
+              </w:rPr>
+              <w:t>Sí</w:t>
+            </w:r>
+          </w:p>
+        </w:tc>
+        <w:tc>
+          <w:tcPr>
+            <w:tcW w:type="dxa" w:w="1900"/>
+            <w:tcMar>
+              <w:top w:w="90" w:type="dxa"/>
+              <w:start w:w="120" w:type="dxa"/>
+              <w:bottom w:w="90" w:type="dxa"/>
+              <w:end w:w="120" w:type="dxa"/>
+            </w:tcMar>
+            <w:vAlign w:val="center"/>
+          </w:tcPr>
+          <w:p>
+            <w:pPr>
+              <w:spacing w:after="0"/>
+            </w:pPr>
+            <w:r>
+              <w:rPr>
+                <w:rFonts w:ascii="Segoe UI" w:hAnsi="Segoe UI"/>
+                <w:color w:val="0F172A"/>
+                <w:sz w:val="16"/>
+              </w:rPr>
+              <w:t>Sí</w:t>
+            </w:r>
+          </w:p>
+        </w:tc>
+        <w:tc>
+          <w:tcPr>
+            <w:tcW w:type="dxa" w:w="1900"/>
+            <w:tcMar>
+              <w:top w:w="90" w:type="dxa"/>
+              <w:start w:w="120" w:type="dxa"/>
+              <w:bottom w:w="90" w:type="dxa"/>
+              <w:end w:w="120" w:type="dxa"/>
+            </w:tcMar>
+            <w:vAlign w:val="center"/>
+          </w:tcPr>
+          <w:p>
+            <w:pPr>
+              <w:spacing w:after="0"/>
+            </w:pPr>
+            <w:r>
+              <w:rPr>
+                <w:rFonts w:ascii="Segoe UI" w:hAnsi="Segoe UI"/>
+                <w:color w:val="0F172A"/>
+                <w:sz w:val="16"/>
+              </w:rPr>
+              <w:t>No</w:t>
+            </w:r>
+          </w:p>
+        </w:tc>
+      </w:tr>
+      <w:tr>
+        <w:trPr>
+          <w:cantSplit/>
+        </w:trPr>
+        <w:tc>
+          <w:tcPr>
+            <w:tcW w:type="dxa" w:w="3660"/>
+            <w:shd w:fill="F8FAFC"/>
+            <w:tcMar>
+              <w:top w:w="90" w:type="dxa"/>
+              <w:start w:w="120" w:type="dxa"/>
+              <w:bottom w:w="90" w:type="dxa"/>
+              <w:end w:w="120" w:type="dxa"/>
+            </w:tcMar>
+            <w:vAlign w:val="center"/>
+          </w:tcPr>
+          <w:p>
+            <w:pPr>
+              <w:spacing w:after="0"/>
+            </w:pPr>
+            <w:r>
+              <w:rPr>
+                <w:rFonts w:ascii="Segoe UI" w:hAnsi="Segoe UI"/>
+                <w:color w:val="0F172A"/>
+                <w:sz w:val="16"/>
+              </w:rPr>
+              <w:t>Gestión de usuarios</w:t>
+            </w:r>
+          </w:p>
+        </w:tc>
+        <w:tc>
+          <w:tcPr>
+            <w:tcW w:type="dxa" w:w="1900"/>
+            <w:shd w:fill="F8FAFC"/>
+            <w:tcMar>
+              <w:top w:w="90" w:type="dxa"/>
+              <w:start w:w="120" w:type="dxa"/>
+              <w:bottom w:w="90" w:type="dxa"/>
+              <w:end w:w="120" w:type="dxa"/>
+            </w:tcMar>
+            <w:vAlign w:val="center"/>
+          </w:tcPr>
+          <w:p>
+            <w:pPr>
+              <w:spacing w:after="0"/>
+            </w:pPr>
+            <w:r>
+              <w:rPr>
+                <w:rFonts w:ascii="Segoe UI" w:hAnsi="Segoe UI"/>
+                <w:color w:val="0F172A"/>
+                <w:sz w:val="16"/>
+              </w:rPr>
+              <w:t>Sí</w:t>
+            </w:r>
+          </w:p>
+        </w:tc>
+        <w:tc>
+          <w:tcPr>
+            <w:tcW w:type="dxa" w:w="1900"/>
+            <w:shd w:fill="F8FAFC"/>
+            <w:tcMar>
+              <w:top w:w="90" w:type="dxa"/>
+              <w:start w:w="120" w:type="dxa"/>
+              <w:bottom w:w="90" w:type="dxa"/>
+              <w:end w:w="120" w:type="dxa"/>
+            </w:tcMar>
+            <w:vAlign w:val="center"/>
+          </w:tcPr>
+          <w:p>
+            <w:pPr>
+              <w:spacing w:after="0"/>
+            </w:pPr>
+            <w:r>
+              <w:rPr>
+                <w:rFonts w:ascii="Segoe UI" w:hAnsi="Segoe UI"/>
+                <w:color w:val="0F172A"/>
+                <w:sz w:val="16"/>
+              </w:rPr>
+              <w:t>No</w:t>
+            </w:r>
+          </w:p>
+        </w:tc>
+        <w:tc>
+          <w:tcPr>
+            <w:tcW w:type="dxa" w:w="1900"/>
+            <w:shd w:fill="F8FAFC"/>
+            <w:tcMar>
+              <w:top w:w="90" w:type="dxa"/>
+              <w:start w:w="120" w:type="dxa"/>
+              <w:bottom w:w="90" w:type="dxa"/>
+              <w:end w:w="120" w:type="dxa"/>
+            </w:tcMar>
+            <w:vAlign w:val="center"/>
+          </w:tcPr>
+          <w:p>
+            <w:pPr>
+              <w:spacing w:after="0"/>
+            </w:pPr>
+            <w:r>
+              <w:rPr>
+                <w:rFonts w:ascii="Segoe UI" w:hAnsi="Segoe UI"/>
+                <w:color w:val="0F172A"/>
+                <w:sz w:val="16"/>
+              </w:rPr>
+              <w:t>No</w:t>
+            </w:r>
+          </w:p>
+        </w:tc>
+      </w:tr>
+      <w:tr>
+        <w:trPr>
+          <w:cantSplit/>
+        </w:trPr>
+        <w:tc>
+          <w:tcPr>
+            <w:tcW w:type="dxa" w:w="3660"/>
+            <w:tcMar>
+              <w:top w:w="90" w:type="dxa"/>
+              <w:start w:w="120" w:type="dxa"/>
+              <w:bottom w:w="90" w:type="dxa"/>
+              <w:end w:w="120" w:type="dxa"/>
+            </w:tcMar>
+            <w:vAlign w:val="center"/>
+          </w:tcPr>
+          <w:p>
+            <w:pPr>
+              <w:spacing w:after="0"/>
+            </w:pPr>
+            <w:r>
+              <w:rPr>
+                <w:rFonts w:ascii="Segoe UI" w:hAnsi="Segoe UI"/>
+                <w:color w:val="0F172A"/>
+                <w:sz w:val="16"/>
+              </w:rPr>
               <w:t>Recuperaciones pendientes</w:t>
             </w:r>
           </w:p>
@@ -4520,6 +4948,60 @@
       <w:r>
         <w:t>Trabaja la cobranza diaria. Puede consultar la ficha de cualquier deudor, incluso de una cartera que no tenga asignada, para atender una llamada y derivar el caso. En cambio, las acciones operativas -registrar gestión o pago- quedan limitadas a sus carteras asignadas y a los reemplazos temporales vigentes. No puede cargar bases ni usar módulos administrativos.</w:t>
       </w:r>
+    </w:p>
+    <w:tbl>
+      <w:tblPr>
+        <w:tblW w:type="dxa" w:w="9360"/>
+        <w:jc w:val="left"/>
+        <w:tblLayout w:type="fixed"/>
+        <w:tblLook w:firstColumn="1" w:firstRow="1" w:lastColumn="0" w:lastRow="0" w:noHBand="0" w:noVBand="1" w:val="04A0"/>
+        <w:tblInd w:w="120" w:type="dxa"/>
+      </w:tblPr>
+      <w:tblGrid>
+        <w:gridCol w:w="9360"/>
+      </w:tblGrid>
+      <w:tr>
+        <w:tc>
+          <w:tcPr>
+            <w:tcW w:type="dxa" w:w="9360"/>
+            <w:tcMar>
+              <w:top w:w="90" w:type="dxa"/>
+              <w:start w:w="120" w:type="dxa"/>
+              <w:bottom w:w="90" w:type="dxa"/>
+              <w:end w:w="120" w:type="dxa"/>
+            </w:tcMar>
+            <w:vAlign w:val="center"/>
+            <w:shd w:fill="EFF6FF"/>
+          </w:tcPr>
+          <w:p>
+            <w:pPr>
+              <w:spacing w:after="0"/>
+            </w:pPr>
+            <w:r>
+              <w:rPr>
+                <w:rFonts w:ascii="Segoe UI" w:hAnsi="Segoe UI"/>
+                <w:b/>
+                <w:color w:val="1D4ED8"/>
+                <w:sz w:val="19"/>
+              </w:rPr>
+              <w:t xml:space="preserve">COMISIONES A LA VISTA  </w:t>
+            </w:r>
+            <w:r>
+              <w:rPr>
+                <w:rFonts w:ascii="Segoe UI" w:hAnsi="Segoe UI"/>
+                <w:color w:val="0F172A"/>
+                <w:sz w:val="19"/>
+              </w:rPr>
+              <w:t>En Dashboard &gt; Mi trabajo, cada ejecutiva ve únicamente su propia comisión acumulada. Ninguna ejecutiva puede ver los montos de otra: la aplicación entrega solo la información del usuario que inició sesión.</w:t>
+            </w:r>
+          </w:p>
+        </w:tc>
+      </w:tr>
+    </w:tbl>
+    <w:p>
+      <w:pPr>
+        <w:spacing w:after="0"/>
+      </w:pPr>
     </w:p>
     <w:tbl>
       <w:tblPr>
@@ -4832,7 +5314,7 @@
                 <w:color w:val="0F172A"/>
                 <w:sz w:val="17"/>
               </w:rPr>
-              <w:t>Salud operativa</w:t>
+              <w:t>Mis comisiones acumuladas</w:t>
             </w:r>
           </w:p>
         </w:tc>
@@ -4857,7 +5339,7 @@
                 <w:color w:val="0F172A"/>
                 <w:sz w:val="17"/>
               </w:rPr>
-              <w:t>Resumen automático del estado de la cartera visible.</w:t>
+              <w:t>Tarjeta superior, solo para el perfil Ejecutivo: monto ganado en comisiones hasta el momento.</w:t>
             </w:r>
           </w:p>
         </w:tc>
@@ -4888,7 +5370,7 @@
                 <w:color w:val="0F172A"/>
                 <w:sz w:val="17"/>
               </w:rPr>
-              <w:t>Foco del día</w:t>
+              <w:t>Alertas críticas</w:t>
             </w:r>
           </w:p>
         </w:tc>
@@ -4914,7 +5396,7 @@
                 <w:color w:val="0F172A"/>
                 <w:sz w:val="17"/>
               </w:rPr>
-              <w:t>Recomendación de atención inmediata basada en datos disponibles.</w:t>
+              <w:t>Acceso rápido a casos que requieren prioridad.</w:t>
             </w:r>
           </w:p>
         </w:tc>
@@ -4944,7 +5426,7 @@
                 <w:color w:val="0F172A"/>
                 <w:sz w:val="17"/>
               </w:rPr>
-              <w:t>Alertas críticas</w:t>
+              <w:t>Oportunidades de contacto</w:t>
             </w:r>
           </w:p>
         </w:tc>
@@ -4969,7 +5451,7 @@
                 <w:color w:val="0F172A"/>
                 <w:sz w:val="17"/>
               </w:rPr>
-              <w:t>Acceso rápido a casos que requieren prioridad.</w:t>
+              <w:t>Casos con canales de contacto disponibles.</w:t>
             </w:r>
           </w:p>
         </w:tc>
@@ -5000,7 +5482,7 @@
                 <w:color w:val="0F172A"/>
                 <w:sz w:val="17"/>
               </w:rPr>
-              <w:t>Oportunidades de contacto</w:t>
+              <w:t>Colas inteligentes</w:t>
             </w:r>
           </w:p>
         </w:tc>
@@ -5026,7 +5508,7 @@
                 <w:color w:val="0F172A"/>
                 <w:sz w:val="17"/>
               </w:rPr>
-              <w:t>Casos con canales de contacto disponibles.</w:t>
+              <w:t>Agrupaciones de trabajo calculadas para orientar la jornada.</w:t>
             </w:r>
           </w:p>
         </w:tc>
@@ -5056,7 +5538,7 @@
                 <w:color w:val="0F172A"/>
                 <w:sz w:val="17"/>
               </w:rPr>
-              <w:t>Colas inteligentes</w:t>
+              <w:t>Filtros de trabajo</w:t>
             </w:r>
           </w:p>
         </w:tc>
@@ -5081,7 +5563,7 @@
                 <w:color w:val="0F172A"/>
                 <w:sz w:val="17"/>
               </w:rPr>
-              <w:t>Agrupaciones de trabajo calculadas para orientar la jornada.</w:t>
+              <w:t>Búsqueda libre, compañía, estado, antigüedad, saldo y disponibilidad de contacto.</w:t>
             </w:r>
           </w:p>
         </w:tc>
@@ -5112,7 +5594,7 @@
                 <w:color w:val="0F172A"/>
                 <w:sz w:val="17"/>
               </w:rPr>
-              <w:t>Filtros de trabajo</w:t>
+              <w:t>Cola priorizada</w:t>
             </w:r>
           </w:p>
         </w:tc>
@@ -5138,7 +5620,7 @@
                 <w:color w:val="0F172A"/>
                 <w:sz w:val="17"/>
               </w:rPr>
-              <w:t>Búsqueda libre, compañía, estado, antigüedad, saldo y disponibilidad de contacto.</w:t>
+              <w:t>Lista ordenada de casos; muestra RUT, estado, motivo de prioridad, saldo y antigüedad.</w:t>
             </w:r>
           </w:p>
         </w:tc>
@@ -5168,7 +5650,7 @@
                 <w:color w:val="0F172A"/>
                 <w:sz w:val="17"/>
               </w:rPr>
-              <w:t>Cola priorizada</w:t>
+              <w:t>Resumen ejecutivo</w:t>
             </w:r>
           </w:p>
         </w:tc>
@@ -5193,7 +5675,111 @@
                 <w:color w:val="0F172A"/>
                 <w:sz w:val="17"/>
               </w:rPr>
-              <w:t>Lista ordenada de casos; muestra RUT, estado, motivo de prioridad, saldo y antigüedad.</w:t>
+              <w:t>Segunda pestaña: cartera total, saldo, cobertura, embudo por estado y foco del día.</w:t>
+            </w:r>
+          </w:p>
+        </w:tc>
+      </w:tr>
+    </w:tbl>
+    <w:p>
+      <w:pPr>
+        <w:spacing w:after="20"/>
+      </w:pPr>
+    </w:p>
+    <w:p>
+      <w:pPr>
+        <w:pStyle w:val="Heading3"/>
+      </w:pPr>
+      <w:r>
+        <w:t>Mis comisiones acumuladas</w:t>
+      </w:r>
+    </w:p>
+    <w:p>
+      <w:r>
+        <w:t>Esta tarjeta muestra cuánto lleva ganado la ejecutiva en comisiones. El monto sube automáticamente cada vez que ella registra un pago: la aplicación toma el monto pagado y le aplica el porcentaje que el Supervisor definió para esa cartera.</w:t>
+      </w:r>
+    </w:p>
+    <w:p>
+      <w:r>
+        <w:rPr>
+          <w:rFonts w:ascii="Segoe UI" w:hAnsi="Segoe UI"/>
+          <w:b/>
+          <w:color w:val="0F172A"/>
+        </w:rPr>
+        <w:t>Ejemplo:</w:t>
+      </w:r>
+      <w:r>
+        <w:t xml:space="preserve"> si la cartera Cart-56 tiene un 10% de comisión y la ejecutiva registra un pago de $100.000, la tarjeta muestra $10.000. Si después registra un pago de $1.000.000, se suman $100.000 y la tarjeta pasa a mostrar $110.000.</w:t>
+      </w:r>
+    </w:p>
+    <w:tbl>
+      <w:tblPr>
+        <w:tblStyle w:val="TableGrid"/>
+        <w:tblW w:type="dxa" w:w="9360"/>
+        <w:jc w:val="left"/>
+        <w:tblLayout w:type="fixed"/>
+        <w:tblLook w:firstColumn="1" w:firstRow="1" w:lastColumn="0" w:lastRow="0" w:noHBand="0" w:noVBand="1" w:val="04A0"/>
+        <w:tblInd w:w="120" w:type="dxa"/>
+      </w:tblPr>
+      <w:tblGrid>
+        <w:gridCol w:w="2600"/>
+        <w:gridCol w:w="6760"/>
+      </w:tblGrid>
+      <w:tr>
+        <w:trPr>
+          <w:tblHeader w:val="true"/>
+        </w:trPr>
+        <w:tc>
+          <w:tcPr>
+            <w:tcW w:type="dxa" w:w="2600"/>
+            <w:shd w:fill="2563EB"/>
+            <w:tcMar>
+              <w:top w:w="90" w:type="dxa"/>
+              <w:start w:w="120" w:type="dxa"/>
+              <w:bottom w:w="90" w:type="dxa"/>
+              <w:end w:w="120" w:type="dxa"/>
+            </w:tcMar>
+            <w:vAlign w:val="center"/>
+          </w:tcPr>
+          <w:p>
+            <w:pPr>
+              <w:spacing w:after="0"/>
+            </w:pPr>
+            <w:r>
+              <w:rPr>
+                <w:rFonts w:ascii="Segoe UI" w:hAnsi="Segoe UI"/>
+                <w:b/>
+                <w:color w:val="FFFFFF"/>
+                <w:sz w:val="17"/>
+              </w:rPr>
+              <w:t>Dato de la tarjeta</w:t>
+            </w:r>
+          </w:p>
+        </w:tc>
+        <w:tc>
+          <w:tcPr>
+            <w:tcW w:type="dxa" w:w="6760"/>
+            <w:shd w:fill="2563EB"/>
+            <w:tcMar>
+              <w:top w:w="90" w:type="dxa"/>
+              <w:start w:w="120" w:type="dxa"/>
+              <w:bottom w:w="90" w:type="dxa"/>
+              <w:end w:w="120" w:type="dxa"/>
+            </w:tcMar>
+            <w:vAlign w:val="center"/>
+          </w:tcPr>
+          <w:p>
+            <w:pPr>
+              <w:spacing w:after="0"/>
+            </w:pPr>
+            <w:r>
+              <w:rPr>
+                <w:rFonts w:ascii="Segoe UI" w:hAnsi="Segoe UI"/>
+                <w:b/>
+                <w:color w:val="FFFFFF"/>
+                <w:sz w:val="17"/>
+              </w:rPr>
+              <w:t>Qué significa</w:t>
             </w:r>
           </w:p>
         </w:tc>
@@ -5204,8 +5790,7 @@
         </w:trPr>
         <w:tc>
           <w:tcPr>
-            <w:tcW w:type="dxa" w:w="2250"/>
-            <w:shd w:fill="F8FAFC"/>
+            <w:tcW w:type="dxa" w:w="2600"/>
             <w:tcMar>
               <w:top w:w="90" w:type="dxa"/>
               <w:start w:w="120" w:type="dxa"/>
@@ -5224,14 +5809,13 @@
                 <w:color w:val="0F172A"/>
                 <w:sz w:val="17"/>
               </w:rPr>
-              <w:t>Embudo de cartera</w:t>
-            </w:r>
-          </w:p>
-        </w:tc>
-        <w:tc>
-          <w:tcPr>
-            <w:tcW w:type="dxa" w:w="7110"/>
-            <w:shd w:fill="F8FAFC"/>
+              <w:t>Monto grande</w:t>
+            </w:r>
+          </w:p>
+        </w:tc>
+        <w:tc>
+          <w:tcPr>
+            <w:tcW w:type="dxa" w:w="6760"/>
             <w:tcMar>
               <w:top w:w="90" w:type="dxa"/>
               <w:start w:w="120" w:type="dxa"/>
@@ -5250,7 +5834,176 @@
                 <w:color w:val="0F172A"/>
                 <w:sz w:val="17"/>
               </w:rPr>
-              <w:t>Distribución de deudores por estado.</w:t>
+              <w:t>Total de comisiones acumuladas desde el último corte.</w:t>
+            </w:r>
+          </w:p>
+        </w:tc>
+      </w:tr>
+      <w:tr>
+        <w:trPr>
+          <w:cantSplit/>
+        </w:trPr>
+        <w:tc>
+          <w:tcPr>
+            <w:tcW w:type="dxa" w:w="2600"/>
+            <w:shd w:fill="F8FAFC"/>
+            <w:tcMar>
+              <w:top w:w="90" w:type="dxa"/>
+              <w:start w:w="120" w:type="dxa"/>
+              <w:bottom w:w="90" w:type="dxa"/>
+              <w:end w:w="120" w:type="dxa"/>
+            </w:tcMar>
+            <w:vAlign w:val="center"/>
+          </w:tcPr>
+          <w:p>
+            <w:pPr>
+              <w:spacing w:after="0"/>
+            </w:pPr>
+            <w:r>
+              <w:rPr>
+                <w:rFonts w:ascii="Segoe UI" w:hAnsi="Segoe UI"/>
+                <w:color w:val="0F172A"/>
+                <w:sz w:val="17"/>
+              </w:rPr>
+              <w:t>Pagos registrados / recaudado</w:t>
+            </w:r>
+          </w:p>
+        </w:tc>
+        <w:tc>
+          <w:tcPr>
+            <w:tcW w:type="dxa" w:w="6760"/>
+            <w:shd w:fill="F8FAFC"/>
+            <w:tcMar>
+              <w:top w:w="90" w:type="dxa"/>
+              <w:start w:w="120" w:type="dxa"/>
+              <w:bottom w:w="90" w:type="dxa"/>
+              <w:end w:w="120" w:type="dxa"/>
+            </w:tcMar>
+            <w:vAlign w:val="center"/>
+          </w:tcPr>
+          <w:p>
+            <w:pPr>
+              <w:spacing w:after="0"/>
+            </w:pPr>
+            <w:r>
+              <w:rPr>
+                <w:rFonts w:ascii="Segoe UI" w:hAnsi="Segoe UI"/>
+                <w:color w:val="0F172A"/>
+                <w:sz w:val="17"/>
+              </w:rPr>
+              <w:t>Cantidad de pagos que suman a la comisión y monto total cobrado.</w:t>
+            </w:r>
+          </w:p>
+        </w:tc>
+      </w:tr>
+      <w:tr>
+        <w:trPr>
+          <w:cantSplit/>
+        </w:trPr>
+        <w:tc>
+          <w:tcPr>
+            <w:tcW w:type="dxa" w:w="2600"/>
+            <w:tcMar>
+              <w:top w:w="90" w:type="dxa"/>
+              <w:start w:w="120" w:type="dxa"/>
+              <w:bottom w:w="90" w:type="dxa"/>
+              <w:end w:w="120" w:type="dxa"/>
+            </w:tcMar>
+            <w:vAlign w:val="center"/>
+          </w:tcPr>
+          <w:p>
+            <w:pPr>
+              <w:spacing w:after="0"/>
+            </w:pPr>
+            <w:r>
+              <w:rPr>
+                <w:rFonts w:ascii="Segoe UI" w:hAnsi="Segoe UI"/>
+                <w:color w:val="0F172A"/>
+                <w:sz w:val="17"/>
+              </w:rPr>
+              <w:t>Porcentaje por cartera</w:t>
+            </w:r>
+          </w:p>
+        </w:tc>
+        <w:tc>
+          <w:tcPr>
+            <w:tcW w:type="dxa" w:w="6760"/>
+            <w:tcMar>
+              <w:top w:w="90" w:type="dxa"/>
+              <w:start w:w="120" w:type="dxa"/>
+              <w:bottom w:w="90" w:type="dxa"/>
+              <w:end w:w="120" w:type="dxa"/>
+            </w:tcMar>
+            <w:vAlign w:val="center"/>
+          </w:tcPr>
+          <w:p>
+            <w:pPr>
+              <w:spacing w:after="0"/>
+            </w:pPr>
+            <w:r>
+              <w:rPr>
+                <w:rFonts w:ascii="Segoe UI" w:hAnsi="Segoe UI"/>
+                <w:color w:val="0F172A"/>
+                <w:sz w:val="17"/>
+              </w:rPr>
+              <w:t>Porcentaje vigente en cada cartera asignada a la ejecutiva.</w:t>
+            </w:r>
+          </w:p>
+        </w:tc>
+      </w:tr>
+      <w:tr>
+        <w:trPr>
+          <w:cantSplit/>
+        </w:trPr>
+        <w:tc>
+          <w:tcPr>
+            <w:tcW w:type="dxa" w:w="2600"/>
+            <w:shd w:fill="F8FAFC"/>
+            <w:tcMar>
+              <w:top w:w="90" w:type="dxa"/>
+              <w:start w:w="120" w:type="dxa"/>
+              <w:bottom w:w="90" w:type="dxa"/>
+              <w:end w:w="120" w:type="dxa"/>
+            </w:tcMar>
+            <w:vAlign w:val="center"/>
+          </w:tcPr>
+          <w:p>
+            <w:pPr>
+              <w:spacing w:after="0"/>
+            </w:pPr>
+            <w:r>
+              <w:rPr>
+                <w:rFonts w:ascii="Segoe UI" w:hAnsi="Segoe UI"/>
+                <w:color w:val="0F172A"/>
+                <w:sz w:val="17"/>
+              </w:rPr>
+              <w:t>Acumulado desde</w:t>
+            </w:r>
+          </w:p>
+        </w:tc>
+        <w:tc>
+          <w:tcPr>
+            <w:tcW w:type="dxa" w:w="6760"/>
+            <w:shd w:fill="F8FAFC"/>
+            <w:tcMar>
+              <w:top w:w="90" w:type="dxa"/>
+              <w:start w:w="120" w:type="dxa"/>
+              <w:bottom w:w="90" w:type="dxa"/>
+              <w:end w:w="120" w:type="dxa"/>
+            </w:tcMar>
+            <w:vAlign w:val="center"/>
+          </w:tcPr>
+          <w:p>
+            <w:pPr>
+              <w:spacing w:after="0"/>
+            </w:pPr>
+            <w:r>
+              <w:rPr>
+                <w:rFonts w:ascii="Segoe UI" w:hAnsi="Segoe UI"/>
+                <w:color w:val="0F172A"/>
+                <w:sz w:val="17"/>
+              </w:rPr>
+              <w:t>Fecha del último corte hecho por el Supervisor. Si no hay cortes, dice Acumulado histórico.</w:t>
             </w:r>
           </w:p>
         </w:tc>
@@ -5259,6 +6012,114 @@
     <w:p>
       <w:pPr>
         <w:spacing w:after="20"/>
+      </w:pPr>
+    </w:p>
+    <w:tbl>
+      <w:tblPr>
+        <w:tblW w:type="dxa" w:w="9360"/>
+        <w:jc w:val="left"/>
+        <w:tblLayout w:type="fixed"/>
+        <w:tblLook w:firstColumn="1" w:firstRow="1" w:lastColumn="0" w:lastRow="0" w:noHBand="0" w:noVBand="1" w:val="04A0"/>
+        <w:tblInd w:w="120" w:type="dxa"/>
+      </w:tblPr>
+      <w:tblGrid>
+        <w:gridCol w:w="9360"/>
+      </w:tblGrid>
+      <w:tr>
+        <w:tc>
+          <w:tcPr>
+            <w:tcW w:type="dxa" w:w="9360"/>
+            <w:tcMar>
+              <w:top w:w="90" w:type="dxa"/>
+              <w:start w:w="120" w:type="dxa"/>
+              <w:bottom w:w="90" w:type="dxa"/>
+              <w:end w:w="120" w:type="dxa"/>
+            </w:tcMar>
+            <w:vAlign w:val="center"/>
+            <w:shd w:fill="EFF6FF"/>
+          </w:tcPr>
+          <w:p>
+            <w:pPr>
+              <w:spacing w:after="0"/>
+            </w:pPr>
+            <w:r>
+              <w:rPr>
+                <w:rFonts w:ascii="Segoe UI" w:hAnsi="Segoe UI"/>
+                <w:b/>
+                <w:color w:val="1D4ED8"/>
+                <w:sz w:val="19"/>
+              </w:rPr>
+              <w:t xml:space="preserve">POR QUÉ EL MONTO PUEDE VOLVER A $0  </w:t>
+            </w:r>
+            <w:r>
+              <w:rPr>
+                <w:rFonts w:ascii="Segoe UI" w:hAnsi="Segoe UI"/>
+                <w:color w:val="0F172A"/>
+                <w:sz w:val="19"/>
+              </w:rPr>
+              <w:t>Cuando el Supervisor paga las comisiones, deja los montos en $0 para empezar un nuevo período. Los pagos registrados no se borran ni se pierden: solo dejan de sumar al acumulado que se muestra desde esa fecha.</w:t>
+            </w:r>
+          </w:p>
+        </w:tc>
+      </w:tr>
+    </w:tbl>
+    <w:p>
+      <w:pPr>
+        <w:spacing w:after="0"/>
+      </w:pPr>
+    </w:p>
+    <w:tbl>
+      <w:tblPr>
+        <w:tblW w:type="dxa" w:w="9360"/>
+        <w:jc w:val="left"/>
+        <w:tblLayout w:type="fixed"/>
+        <w:tblLook w:firstColumn="1" w:firstRow="1" w:lastColumn="0" w:lastRow="0" w:noHBand="0" w:noVBand="1" w:val="04A0"/>
+        <w:tblInd w:w="120" w:type="dxa"/>
+      </w:tblPr>
+      <w:tblGrid>
+        <w:gridCol w:w="9360"/>
+      </w:tblGrid>
+      <w:tr>
+        <w:tc>
+          <w:tcPr>
+            <w:tcW w:type="dxa" w:w="9360"/>
+            <w:tcMar>
+              <w:top w:w="90" w:type="dxa"/>
+              <w:start w:w="120" w:type="dxa"/>
+              <w:bottom w:w="90" w:type="dxa"/>
+              <w:end w:w="120" w:type="dxa"/>
+            </w:tcMar>
+            <w:vAlign w:val="center"/>
+            <w:shd w:fill="FFF7ED"/>
+          </w:tcPr>
+          <w:p>
+            <w:pPr>
+              <w:spacing w:after="0"/>
+            </w:pPr>
+            <w:r>
+              <w:rPr>
+                <w:rFonts w:ascii="Segoe UI" w:hAnsi="Segoe UI"/>
+                <w:b/>
+                <w:color w:val="B45309"/>
+                <w:sz w:val="19"/>
+              </w:rPr>
+              <w:t xml:space="preserve">SI LA COMISIÓN NO SUBE  </w:t>
+            </w:r>
+            <w:r>
+              <w:rPr>
+                <w:rFonts w:ascii="Segoe UI" w:hAnsi="Segoe UI"/>
+                <w:color w:val="0F172A"/>
+                <w:sz w:val="19"/>
+              </w:rPr>
+              <w:t>Un pago solo genera comisión si la cartera tiene un porcentaje definido. Si registra pagos y la tarjeta sigue en $0, avise al Supervisor para que revise el porcentaje en Administración de carteras. Un pago revertido tampoco suma.</w:t>
+            </w:r>
+          </w:p>
+        </w:tc>
+      </w:tr>
+    </w:tbl>
+    <w:p>
+      <w:pPr>
+        <w:spacing w:after="0"/>
       </w:pPr>
     </w:p>
     <w:p>
@@ -6433,6 +7294,493 @@
       </w:pPr>
     </w:p>
     <w:p>
+      <w:pPr>
+        <w:pStyle w:val="Heading2"/>
+      </w:pPr>
+      <w:r>
+        <w:t>3.5 Comisiones por ejecutiva — Administrador y Supervisor</w:t>
+      </w:r>
+    </w:p>
+    <w:p>
+      <w:r>
+        <w:t>En la Vista general, los perfiles de coordinación disponen de la sección Comisiones por ejecutiva. Muestra una tarjeta por cada ejecutiva activa con su nombre, su correo, el monto acumulado en comisiones y la cantidad de pagos que lo generaron. El perfil Ejecutivo no ve esta sección.</w:t>
+      </w:r>
+    </w:p>
+    <w:tbl>
+      <w:tblPr>
+        <w:tblStyle w:val="TableGrid"/>
+        <w:tblW w:type="dxa" w:w="9360"/>
+        <w:jc w:val="left"/>
+        <w:tblLayout w:type="fixed"/>
+        <w:tblLook w:firstColumn="1" w:firstRow="1" w:lastColumn="0" w:lastRow="0" w:noHBand="0" w:noVBand="1" w:val="04A0"/>
+        <w:tblInd w:w="120" w:type="dxa"/>
+      </w:tblPr>
+      <w:tblGrid>
+        <w:gridCol w:w="2600"/>
+        <w:gridCol w:w="6760"/>
+      </w:tblGrid>
+      <w:tr>
+        <w:trPr>
+          <w:tblHeader w:val="true"/>
+        </w:trPr>
+        <w:tc>
+          <w:tcPr>
+            <w:tcW w:type="dxa" w:w="2600"/>
+            <w:shd w:fill="2563EB"/>
+            <w:tcMar>
+              <w:top w:w="90" w:type="dxa"/>
+              <w:start w:w="120" w:type="dxa"/>
+              <w:bottom w:w="90" w:type="dxa"/>
+              <w:end w:w="120" w:type="dxa"/>
+            </w:tcMar>
+            <w:vAlign w:val="center"/>
+          </w:tcPr>
+          <w:p>
+            <w:pPr>
+              <w:spacing w:after="0"/>
+            </w:pPr>
+            <w:r>
+              <w:rPr>
+                <w:rFonts w:ascii="Segoe UI" w:hAnsi="Segoe UI"/>
+                <w:b/>
+                <w:color w:val="FFFFFF"/>
+                <w:sz w:val="17"/>
+              </w:rPr>
+              <w:t>Dato de cada tarjeta</w:t>
+            </w:r>
+          </w:p>
+        </w:tc>
+        <w:tc>
+          <w:tcPr>
+            <w:tcW w:type="dxa" w:w="6760"/>
+            <w:shd w:fill="2563EB"/>
+            <w:tcMar>
+              <w:top w:w="90" w:type="dxa"/>
+              <w:start w:w="120" w:type="dxa"/>
+              <w:bottom w:w="90" w:type="dxa"/>
+              <w:end w:w="120" w:type="dxa"/>
+            </w:tcMar>
+            <w:vAlign w:val="center"/>
+          </w:tcPr>
+          <w:p>
+            <w:pPr>
+              <w:spacing w:after="0"/>
+            </w:pPr>
+            <w:r>
+              <w:rPr>
+                <w:rFonts w:ascii="Segoe UI" w:hAnsi="Segoe UI"/>
+                <w:b/>
+                <w:color w:val="FFFFFF"/>
+                <w:sz w:val="17"/>
+              </w:rPr>
+              <w:t>Qué significa</w:t>
+            </w:r>
+          </w:p>
+        </w:tc>
+      </w:tr>
+      <w:tr>
+        <w:trPr>
+          <w:cantSplit/>
+        </w:trPr>
+        <w:tc>
+          <w:tcPr>
+            <w:tcW w:type="dxa" w:w="2600"/>
+            <w:tcMar>
+              <w:top w:w="90" w:type="dxa"/>
+              <w:start w:w="120" w:type="dxa"/>
+              <w:bottom w:w="90" w:type="dxa"/>
+              <w:end w:w="120" w:type="dxa"/>
+            </w:tcMar>
+            <w:vAlign w:val="center"/>
+          </w:tcPr>
+          <w:p>
+            <w:pPr>
+              <w:spacing w:after="0"/>
+            </w:pPr>
+            <w:r>
+              <w:rPr>
+                <w:rFonts w:ascii="Segoe UI" w:hAnsi="Segoe UI"/>
+                <w:color w:val="0F172A"/>
+                <w:sz w:val="17"/>
+              </w:rPr>
+              <w:t>Usuario y correo</w:t>
+            </w:r>
+          </w:p>
+        </w:tc>
+        <w:tc>
+          <w:tcPr>
+            <w:tcW w:type="dxa" w:w="6760"/>
+            <w:tcMar>
+              <w:top w:w="90" w:type="dxa"/>
+              <w:start w:w="120" w:type="dxa"/>
+              <w:bottom w:w="90" w:type="dxa"/>
+              <w:end w:w="120" w:type="dxa"/>
+            </w:tcMar>
+            <w:vAlign w:val="center"/>
+          </w:tcPr>
+          <w:p>
+            <w:pPr>
+              <w:spacing w:after="0"/>
+            </w:pPr>
+            <w:r>
+              <w:rPr>
+                <w:rFonts w:ascii="Segoe UI" w:hAnsi="Segoe UI"/>
+                <w:color w:val="0F172A"/>
+                <w:sz w:val="17"/>
+              </w:rPr>
+              <w:t>Ejecutiva a la que corresponde el acumulado.</w:t>
+            </w:r>
+          </w:p>
+        </w:tc>
+      </w:tr>
+      <w:tr>
+        <w:trPr>
+          <w:cantSplit/>
+        </w:trPr>
+        <w:tc>
+          <w:tcPr>
+            <w:tcW w:type="dxa" w:w="2600"/>
+            <w:shd w:fill="F8FAFC"/>
+            <w:tcMar>
+              <w:top w:w="90" w:type="dxa"/>
+              <w:start w:w="120" w:type="dxa"/>
+              <w:bottom w:w="90" w:type="dxa"/>
+              <w:end w:w="120" w:type="dxa"/>
+            </w:tcMar>
+            <w:vAlign w:val="center"/>
+          </w:tcPr>
+          <w:p>
+            <w:pPr>
+              <w:spacing w:after="0"/>
+            </w:pPr>
+            <w:r>
+              <w:rPr>
+                <w:rFonts w:ascii="Segoe UI" w:hAnsi="Segoe UI"/>
+                <w:color w:val="0F172A"/>
+                <w:sz w:val="17"/>
+              </w:rPr>
+              <w:t>Monto en verde</w:t>
+            </w:r>
+          </w:p>
+        </w:tc>
+        <w:tc>
+          <w:tcPr>
+            <w:tcW w:type="dxa" w:w="6760"/>
+            <w:shd w:fill="F8FAFC"/>
+            <w:tcMar>
+              <w:top w:w="90" w:type="dxa"/>
+              <w:start w:w="120" w:type="dxa"/>
+              <w:bottom w:w="90" w:type="dxa"/>
+              <w:end w:w="120" w:type="dxa"/>
+            </w:tcMar>
+            <w:vAlign w:val="center"/>
+          </w:tcPr>
+          <w:p>
+            <w:pPr>
+              <w:spacing w:after="0"/>
+            </w:pPr>
+            <w:r>
+              <w:rPr>
+                <w:rFonts w:ascii="Segoe UI" w:hAnsi="Segoe UI"/>
+                <w:color w:val="0F172A"/>
+                <w:sz w:val="17"/>
+              </w:rPr>
+              <w:t>Comisión acumulada desde el último corte.</w:t>
+            </w:r>
+          </w:p>
+        </w:tc>
+      </w:tr>
+      <w:tr>
+        <w:trPr>
+          <w:cantSplit/>
+        </w:trPr>
+        <w:tc>
+          <w:tcPr>
+            <w:tcW w:type="dxa" w:w="2600"/>
+            <w:tcMar>
+              <w:top w:w="90" w:type="dxa"/>
+              <w:start w:w="120" w:type="dxa"/>
+              <w:bottom w:w="90" w:type="dxa"/>
+              <w:end w:w="120" w:type="dxa"/>
+            </w:tcMar>
+            <w:vAlign w:val="center"/>
+          </w:tcPr>
+          <w:p>
+            <w:pPr>
+              <w:spacing w:after="0"/>
+            </w:pPr>
+            <w:r>
+              <w:rPr>
+                <w:rFonts w:ascii="Segoe UI" w:hAnsi="Segoe UI"/>
+                <w:color w:val="0F172A"/>
+                <w:sz w:val="17"/>
+              </w:rPr>
+              <w:t>Pagos y recaudado</w:t>
+            </w:r>
+          </w:p>
+        </w:tc>
+        <w:tc>
+          <w:tcPr>
+            <w:tcW w:type="dxa" w:w="6760"/>
+            <w:tcMar>
+              <w:top w:w="90" w:type="dxa"/>
+              <w:start w:w="120" w:type="dxa"/>
+              <w:bottom w:w="90" w:type="dxa"/>
+              <w:end w:w="120" w:type="dxa"/>
+            </w:tcMar>
+            <w:vAlign w:val="center"/>
+          </w:tcPr>
+          <w:p>
+            <w:pPr>
+              <w:spacing w:after="0"/>
+            </w:pPr>
+            <w:r>
+              <w:rPr>
+                <w:rFonts w:ascii="Segoe UI" w:hAnsi="Segoe UI"/>
+                <w:color w:val="0F172A"/>
+                <w:sz w:val="17"/>
+              </w:rPr>
+              <w:t>Cantidad de pagos registrados y monto total cobrado que originó la comisión.</w:t>
+            </w:r>
+          </w:p>
+        </w:tc>
+      </w:tr>
+    </w:tbl>
+    <w:p>
+      <w:pPr>
+        <w:spacing w:after="20"/>
+      </w:pPr>
+    </w:p>
+    <w:p>
+      <w:pPr>
+        <w:pStyle w:val="Heading3"/>
+      </w:pPr>
+      <w:r>
+        <w:t>Reestablecer los montos a $0</w:t>
+      </w:r>
+    </w:p>
+    <w:p>
+      <w:r>
+        <w:t>Cuando las comisiones ya fueron pagadas, use el botón Reestablecer montos a $0 para comenzar un período nuevo. La aplicación pedirá confirmación antes de aplicar el corte.</w:t>
+      </w:r>
+    </w:p>
+    <w:p>
+      <w:pPr>
+        <w:spacing w:after="100"/>
+        <w:ind w:left="461" w:hanging="461"/>
+      </w:pPr>
+      <w:r>
+        <w:rPr>
+          <w:rFonts w:ascii="Segoe UI" w:hAnsi="Segoe UI"/>
+          <w:b/>
+          <w:color w:val="1D4ED8"/>
+          <w:sz w:val="20"/>
+        </w:rPr>
+        <w:t xml:space="preserve">1. </w:t>
+      </w:r>
+      <w:r>
+        <w:rPr>
+          <w:rFonts w:ascii="Segoe UI" w:hAnsi="Segoe UI"/>
+          <w:b/>
+          <w:color w:val="0F172A"/>
+          <w:sz w:val="20"/>
+        </w:rPr>
+        <w:t xml:space="preserve">Verifique los montos. </w:t>
+      </w:r>
+      <w:r>
+        <w:t>Registre o exporte los valores mostrados antes del corte; la pantalla dejará de mostrarlos.</w:t>
+      </w:r>
+    </w:p>
+    <w:p>
+      <w:pPr>
+        <w:spacing w:after="100"/>
+        <w:ind w:left="461" w:hanging="461"/>
+      </w:pPr>
+      <w:r>
+        <w:rPr>
+          <w:rFonts w:ascii="Segoe UI" w:hAnsi="Segoe UI"/>
+          <w:b/>
+          <w:color w:val="1D4ED8"/>
+          <w:sz w:val="20"/>
+        </w:rPr>
+        <w:t xml:space="preserve">2. </w:t>
+      </w:r>
+      <w:r>
+        <w:rPr>
+          <w:rFonts w:ascii="Segoe UI" w:hAnsi="Segoe UI"/>
+          <w:b/>
+          <w:color w:val="0F172A"/>
+          <w:sz w:val="20"/>
+        </w:rPr>
+        <w:t xml:space="preserve">Pague las comisiones. </w:t>
+      </w:r>
+      <w:r>
+        <w:t>Realice el pago por el canal administrativo que corresponda.</w:t>
+      </w:r>
+    </w:p>
+    <w:p>
+      <w:pPr>
+        <w:spacing w:after="100"/>
+        <w:ind w:left="461" w:hanging="461"/>
+      </w:pPr>
+      <w:r>
+        <w:rPr>
+          <w:rFonts w:ascii="Segoe UI" w:hAnsi="Segoe UI"/>
+          <w:b/>
+          <w:color w:val="1D4ED8"/>
+          <w:sz w:val="20"/>
+        </w:rPr>
+        <w:t xml:space="preserve">3. </w:t>
+      </w:r>
+      <w:r>
+        <w:rPr>
+          <w:rFonts w:ascii="Segoe UI" w:hAnsi="Segoe UI"/>
+          <w:b/>
+          <w:color w:val="0F172A"/>
+          <w:sz w:val="20"/>
+        </w:rPr>
+        <w:t xml:space="preserve">Pulse Reestablecer montos a $0. </w:t>
+      </w:r>
+      <w:r>
+        <w:t>Confirme en el mensaje de la aplicación.</w:t>
+      </w:r>
+    </w:p>
+    <w:p>
+      <w:pPr>
+        <w:spacing w:after="100"/>
+        <w:ind w:left="461" w:hanging="461"/>
+      </w:pPr>
+      <w:r>
+        <w:rPr>
+          <w:rFonts w:ascii="Segoe UI" w:hAnsi="Segoe UI"/>
+          <w:b/>
+          <w:color w:val="1D4ED8"/>
+          <w:sz w:val="20"/>
+        </w:rPr>
+        <w:t xml:space="preserve">4. </w:t>
+      </w:r>
+      <w:r>
+        <w:rPr>
+          <w:rFonts w:ascii="Segoe UI" w:hAnsi="Segoe UI"/>
+          <w:b/>
+          <w:color w:val="0F172A"/>
+          <w:sz w:val="20"/>
+        </w:rPr>
+        <w:t xml:space="preserve">Compruebe el resultado. </w:t>
+      </w:r>
+      <w:r>
+        <w:t>Todas las tarjetas deben quedar en $ 0 y las ejecutivas verán su tarjeta reiniciada.</w:t>
+      </w:r>
+    </w:p>
+    <w:tbl>
+      <w:tblPr>
+        <w:tblW w:type="dxa" w:w="9360"/>
+        <w:jc w:val="left"/>
+        <w:tblLayout w:type="fixed"/>
+        <w:tblLook w:firstColumn="1" w:firstRow="1" w:lastColumn="0" w:lastRow="0" w:noHBand="0" w:noVBand="1" w:val="04A0"/>
+        <w:tblInd w:w="120" w:type="dxa"/>
+      </w:tblPr>
+      <w:tblGrid>
+        <w:gridCol w:w="9360"/>
+      </w:tblGrid>
+      <w:tr>
+        <w:tc>
+          <w:tcPr>
+            <w:tcW w:type="dxa" w:w="9360"/>
+            <w:tcMar>
+              <w:top w:w="90" w:type="dxa"/>
+              <w:start w:w="120" w:type="dxa"/>
+              <w:bottom w:w="90" w:type="dxa"/>
+              <w:end w:w="120" w:type="dxa"/>
+            </w:tcMar>
+            <w:vAlign w:val="center"/>
+            <w:shd w:fill="EFF6FF"/>
+          </w:tcPr>
+          <w:p>
+            <w:pPr>
+              <w:spacing w:after="0"/>
+            </w:pPr>
+            <w:r>
+              <w:rPr>
+                <w:rFonts w:ascii="Segoe UI" w:hAnsi="Segoe UI"/>
+                <w:b/>
+                <w:color w:val="1D4ED8"/>
+                <w:sz w:val="19"/>
+              </w:rPr>
+              <w:t xml:space="preserve">EL CORTE NO BORRA PAGOS  </w:t>
+            </w:r>
+            <w:r>
+              <w:rPr>
+                <w:rFonts w:ascii="Segoe UI" w:hAnsi="Segoe UI"/>
+                <w:color w:val="0F172A"/>
+                <w:sz w:val="19"/>
+              </w:rPr>
+              <w:t>Reestablecer solo marca desde qué fecha se vuelve a acumular. Los pagos registrados, los saldos de los deudores y el historial de gestiones no se modifican en absoluto.</w:t>
+            </w:r>
+          </w:p>
+        </w:tc>
+      </w:tr>
+    </w:tbl>
+    <w:p>
+      <w:pPr>
+        <w:spacing w:after="0"/>
+      </w:pPr>
+    </w:p>
+    <w:tbl>
+      <w:tblPr>
+        <w:tblW w:type="dxa" w:w="9360"/>
+        <w:jc w:val="left"/>
+        <w:tblLayout w:type="fixed"/>
+        <w:tblLook w:firstColumn="1" w:firstRow="1" w:lastColumn="0" w:lastRow="0" w:noHBand="0" w:noVBand="1" w:val="04A0"/>
+        <w:tblInd w:w="120" w:type="dxa"/>
+      </w:tblPr>
+      <w:tblGrid>
+        <w:gridCol w:w="9360"/>
+      </w:tblGrid>
+      <w:tr>
+        <w:tc>
+          <w:tcPr>
+            <w:tcW w:type="dxa" w:w="9360"/>
+            <w:tcMar>
+              <w:top w:w="90" w:type="dxa"/>
+              <w:start w:w="120" w:type="dxa"/>
+              <w:bottom w:w="90" w:type="dxa"/>
+              <w:end w:w="120" w:type="dxa"/>
+            </w:tcMar>
+            <w:vAlign w:val="center"/>
+            <w:shd w:fill="FFF7ED"/>
+          </w:tcPr>
+          <w:p>
+            <w:pPr>
+              <w:spacing w:after="0"/>
+            </w:pPr>
+            <w:r>
+              <w:rPr>
+                <w:rFonts w:ascii="Segoe UI" w:hAnsi="Segoe UI"/>
+                <w:b/>
+                <w:color w:val="B45309"/>
+                <w:sz w:val="19"/>
+              </w:rPr>
+              <w:t xml:space="preserve">EL CORTE APLICA A TODAS  </w:t>
+            </w:r>
+            <w:r>
+              <w:rPr>
+                <w:rFonts w:ascii="Segoe UI" w:hAnsi="Segoe UI"/>
+                <w:color w:val="0F172A"/>
+                <w:sz w:val="19"/>
+              </w:rPr>
+              <w:t>El botón reinicia el acumulado de todas las ejecutivas a la vez, no de una sola. Úselo cuando el pago de comisiones ya se haya hecho para todo el equipo.</w:t>
+            </w:r>
+          </w:p>
+        </w:tc>
+      </w:tr>
+    </w:tbl>
+    <w:p>
+      <w:pPr>
+        <w:spacing w:after="0"/>
+      </w:pPr>
+    </w:p>
+    <w:p>
       <w:r>
         <w:br w:type="page"/>
       </w:r>
@@ -9019,6 +10367,11 @@
       </w:pPr>
     </w:p>
     <w:p>
+      <w:r>
+        <w:t>Cada pago confirmado suma automáticamente a la tarjeta Mis comisiones acumuladas del Dashboard, según el porcentaje definido para esa cartera (sección 3.2). No hay que registrar la comisión por separado. Si el Supervisor revierte el pago, la comisión correspondiente deja de sumar.</w:t>
+      </w:r>
+    </w:p>
+    <w:p>
       <w:pPr>
         <w:pStyle w:val="Heading2"/>
       </w:pPr>
@@ -11505,7 +12858,25 @@
         <w:pStyle w:val="Heading2"/>
       </w:pPr>
       <w:r>
-        <w:t>8.2 Asignar carteras</w:t>
+        <w:t>8.2 Asignar carteras y definir comisiones</w:t>
+      </w:r>
+    </w:p>
+    <w:p>
+      <w:r>
+        <w:t>La tarjeta Asignación de carteras reúne dos cosas: la tabla con el porcentaje de comisión de cada cartera y, más abajo, el responsable asignado a cada compañía. Un solo botón guarda ambas.</w:t>
+      </w:r>
+    </w:p>
+    <w:p>
+      <w:pPr>
+        <w:pStyle w:val="Heading3"/>
+      </w:pPr>
+      <w:r>
+        <w:t>Porcentaje de comisión por cartera</w:t>
+      </w:r>
+    </w:p>
+    <w:p>
+      <w:r>
+        <w:t>La tabla superior lista las carteras disponibles y, junto a cada una, el campo % Comisión. Ese porcentaje se aplica sobre cada pago que la ejecutiva registre en esa cartera y alimenta las tarjetas de comisiones del Dashboard.</w:t>
       </w:r>
     </w:p>
     <w:p>
@@ -11529,10 +12900,10 @@
           <w:color w:val="0F172A"/>
           <w:sz w:val="20"/>
         </w:rPr>
-        <w:t xml:space="preserve">Ubique la compañía. </w:t>
-      </w:r>
-      <w:r>
-        <w:t>Cada compañía tiene una lista de ejecutivos activos.</w:t>
+        <w:t xml:space="preserve">Ubique la cartera. </w:t>
+      </w:r>
+      <w:r>
+        <w:t>Cada fila de la tabla corresponde a una compañía.</w:t>
       </w:r>
     </w:p>
     <w:p>
@@ -11556,10 +12927,10 @@
           <w:color w:val="0F172A"/>
           <w:sz w:val="20"/>
         </w:rPr>
-        <w:t xml:space="preserve">Seleccione responsable. </w:t>
-      </w:r>
-      <w:r>
-        <w:t>Elija el ejecutivo o Sin asignación.</w:t>
+        <w:t xml:space="preserve">Escriba el porcentaje. </w:t>
+      </w:r>
+      <w:r>
+        <w:t>Admite valores entre 0 y 100, con hasta dos decimales. Por ejemplo, 10 significa 10% de comisión.</w:t>
       </w:r>
     </w:p>
     <w:p>
@@ -11583,6 +12954,95 @@
           <w:color w:val="0F172A"/>
           <w:sz w:val="20"/>
         </w:rPr>
+        <w:t xml:space="preserve">Deje en 0 lo que no comisiona. </w:t>
+      </w:r>
+      <w:r>
+        <w:t>Una cartera en 0% registra los pagos igual, pero no genera comisión.</w:t>
+      </w:r>
+    </w:p>
+    <w:p>
+      <w:pPr>
+        <w:pStyle w:val="Heading3"/>
+      </w:pPr>
+      <w:r>
+        <w:t>Responsable de cada compañía</w:t>
+      </w:r>
+    </w:p>
+    <w:p>
+      <w:pPr>
+        <w:spacing w:after="100"/>
+        <w:ind w:left="461" w:hanging="461"/>
+      </w:pPr>
+      <w:r>
+        <w:rPr>
+          <w:rFonts w:ascii="Segoe UI" w:hAnsi="Segoe UI"/>
+          <w:b/>
+          <w:color w:val="1D4ED8"/>
+          <w:sz w:val="20"/>
+        </w:rPr>
+        <w:t xml:space="preserve">1. </w:t>
+      </w:r>
+      <w:r>
+        <w:rPr>
+          <w:rFonts w:ascii="Segoe UI" w:hAnsi="Segoe UI"/>
+          <w:b/>
+          <w:color w:val="0F172A"/>
+          <w:sz w:val="20"/>
+        </w:rPr>
+        <w:t xml:space="preserve">Ubique la compañía. </w:t>
+      </w:r>
+      <w:r>
+        <w:t>Cada compañía tiene una lista de ejecutivos activos.</w:t>
+      </w:r>
+    </w:p>
+    <w:p>
+      <w:pPr>
+        <w:spacing w:after="100"/>
+        <w:ind w:left="461" w:hanging="461"/>
+      </w:pPr>
+      <w:r>
+        <w:rPr>
+          <w:rFonts w:ascii="Segoe UI" w:hAnsi="Segoe UI"/>
+          <w:b/>
+          <w:color w:val="1D4ED8"/>
+          <w:sz w:val="20"/>
+        </w:rPr>
+        <w:t xml:space="preserve">2. </w:t>
+      </w:r>
+      <w:r>
+        <w:rPr>
+          <w:rFonts w:ascii="Segoe UI" w:hAnsi="Segoe UI"/>
+          <w:b/>
+          <w:color w:val="0F172A"/>
+          <w:sz w:val="20"/>
+        </w:rPr>
+        <w:t xml:space="preserve">Seleccione responsable. </w:t>
+      </w:r>
+      <w:r>
+        <w:t>Elija el ejecutivo o Sin asignación.</w:t>
+      </w:r>
+    </w:p>
+    <w:p>
+      <w:pPr>
+        <w:spacing w:after="100"/>
+        <w:ind w:left="461" w:hanging="461"/>
+      </w:pPr>
+      <w:r>
+        <w:rPr>
+          <w:rFonts w:ascii="Segoe UI" w:hAnsi="Segoe UI"/>
+          <w:b/>
+          <w:color w:val="1D4ED8"/>
+          <w:sz w:val="20"/>
+        </w:rPr>
+        <w:t xml:space="preserve">3. </w:t>
+      </w:r>
+      <w:r>
+        <w:rPr>
+          <w:rFonts w:ascii="Segoe UI" w:hAnsi="Segoe UI"/>
+          <w:b/>
+          <w:color w:val="0F172A"/>
+          <w:sz w:val="20"/>
+        </w:rPr>
         <w:t xml:space="preserve">Revise todas las compañías. </w:t>
       </w:r>
       <w:r>
@@ -11610,7 +13070,7 @@
           <w:color w:val="0F172A"/>
           <w:sz w:val="20"/>
         </w:rPr>
-        <w:t xml:space="preserve">Pulse Guardar asignaciones. </w:t>
+        <w:t xml:space="preserve">Pulse Guardar asignaciones y comisiones. </w:t>
       </w:r>
       <w:r>
         <w:t>Espere el mensaje de confirmación.</w:t>
@@ -11620,6 +13080,114 @@
       <w:r>
         <w:t>La asignación controla la información que ve y opera el Ejecutivo. Cuando cambie, solicite al usuario cerrar sesión y volver a ingresar.</w:t>
       </w:r>
+    </w:p>
+    <w:tbl>
+      <w:tblPr>
+        <w:tblW w:type="dxa" w:w="9360"/>
+        <w:jc w:val="left"/>
+        <w:tblLayout w:type="fixed"/>
+        <w:tblLook w:firstColumn="1" w:firstRow="1" w:lastColumn="0" w:lastRow="0" w:noHBand="0" w:noVBand="1" w:val="04A0"/>
+        <w:tblInd w:w="120" w:type="dxa"/>
+      </w:tblPr>
+      <w:tblGrid>
+        <w:gridCol w:w="9360"/>
+      </w:tblGrid>
+      <w:tr>
+        <w:tc>
+          <w:tcPr>
+            <w:tcW w:type="dxa" w:w="9360"/>
+            <w:tcMar>
+              <w:top w:w="90" w:type="dxa"/>
+              <w:start w:w="120" w:type="dxa"/>
+              <w:bottom w:w="90" w:type="dxa"/>
+              <w:end w:w="120" w:type="dxa"/>
+            </w:tcMar>
+            <w:vAlign w:val="center"/>
+            <w:shd w:fill="FFF7ED"/>
+          </w:tcPr>
+          <w:p>
+            <w:pPr>
+              <w:spacing w:after="0"/>
+            </w:pPr>
+            <w:r>
+              <w:rPr>
+                <w:rFonts w:ascii="Segoe UI" w:hAnsi="Segoe UI"/>
+                <w:b/>
+                <w:color w:val="B45309"/>
+                <w:sz w:val="19"/>
+              </w:rPr>
+              <w:t xml:space="preserve">EL PORCENTAJE RIGE HACIA ADELANTE Y HACIA ATRÁS  </w:t>
+            </w:r>
+            <w:r>
+              <w:rPr>
+                <w:rFonts w:ascii="Segoe UI" w:hAnsi="Segoe UI"/>
+                <w:color w:val="0F172A"/>
+                <w:sz w:val="19"/>
+              </w:rPr>
+              <w:t>El acumulado se calcula siempre con el porcentaje vigente. Si modifica el porcentaje de una cartera, las comisiones aún no pagadas de esa cartera se recalculan con el valor nuevo. Ajuste el porcentaje justo después de un corte para evitar confusiones con el equipo.</w:t>
+            </w:r>
+          </w:p>
+        </w:tc>
+      </w:tr>
+    </w:tbl>
+    <w:p>
+      <w:pPr>
+        <w:spacing w:after="0"/>
+      </w:pPr>
+    </w:p>
+    <w:tbl>
+      <w:tblPr>
+        <w:tblW w:type="dxa" w:w="9360"/>
+        <w:jc w:val="left"/>
+        <w:tblLayout w:type="fixed"/>
+        <w:tblLook w:firstColumn="1" w:firstRow="1" w:lastColumn="0" w:lastRow="0" w:noHBand="0" w:noVBand="1" w:val="04A0"/>
+        <w:tblInd w:w="120" w:type="dxa"/>
+      </w:tblPr>
+      <w:tblGrid>
+        <w:gridCol w:w="9360"/>
+      </w:tblGrid>
+      <w:tr>
+        <w:tc>
+          <w:tcPr>
+            <w:tcW w:type="dxa" w:w="9360"/>
+            <w:tcMar>
+              <w:top w:w="90" w:type="dxa"/>
+              <w:start w:w="120" w:type="dxa"/>
+              <w:bottom w:w="90" w:type="dxa"/>
+              <w:end w:w="120" w:type="dxa"/>
+            </w:tcMar>
+            <w:vAlign w:val="center"/>
+            <w:shd w:fill="EFF6FF"/>
+          </w:tcPr>
+          <w:p>
+            <w:pPr>
+              <w:spacing w:after="0"/>
+            </w:pPr>
+            <w:r>
+              <w:rPr>
+                <w:rFonts w:ascii="Segoe UI" w:hAnsi="Segoe UI"/>
+                <w:b/>
+                <w:color w:val="1D4ED8"/>
+                <w:sz w:val="19"/>
+              </w:rPr>
+              <w:t xml:space="preserve">GUARDADO PARCIAL  </w:t>
+            </w:r>
+            <w:r>
+              <w:rPr>
+                <w:rFonts w:ascii="Segoe UI" w:hAnsi="Segoe UI"/>
+                <w:color w:val="0F172A"/>
+                <w:sz w:val="19"/>
+              </w:rPr>
+              <w:t>Si la aplicación avisa que las asignaciones se guardaron pero los porcentajes no, revise la conexión y vuelva a pulsar el botón. Las asignaciones ya guardadas no se duplican.</w:t>
+            </w:r>
+          </w:p>
+        </w:tc>
+      </w:tr>
+    </w:tbl>
+    <w:p>
+      <w:pPr>
+        <w:spacing w:after="0"/>
+      </w:pPr>
     </w:p>
     <w:p>
       <w:pPr>
@@ -13222,7 +14790,7 @@
                 <w:color w:val="0F172A"/>
                 <w:sz w:val="16"/>
               </w:rPr>
-              <w:t>Validar nuevo saldo y pagos acumulados.</w:t>
+              <w:t>Validar nuevo saldo, pagos acumulados y la tarjeta de comisiones.</w:t>
             </w:r>
           </w:p>
         </w:tc>
@@ -13348,7 +14916,17 @@
         <w:ind w:left="403" w:hanging="230"/>
       </w:pPr>
       <w:r>
-        <w:t>Comprobar asignaciones y reemplazos antes de la jornada.</w:t>
+        <w:t>Comprobar asignaciones, porcentajes de comisión y reemplazos antes de la jornada.</w:t>
+      </w:r>
+    </w:p>
+    <w:p>
+      <w:pPr>
+        <w:pStyle w:val="ListBullet"/>
+        <w:spacing w:after="60"/>
+        <w:ind w:left="403" w:hanging="230"/>
+      </w:pPr>
+      <w:r>
+        <w:t>Revisar Comisiones por ejecutiva; al pagar el período, registrar los montos y luego reestablecerlos a $0.</w:t>
       </w:r>
     </w:p>
     <w:p>
@@ -14983,6 +16561,169 @@
                 <w:color w:val="0F172A"/>
                 <w:sz w:val="15"/>
               </w:rPr>
+              <w:t>La comisión sigue en $0</w:t>
+            </w:r>
+          </w:p>
+        </w:tc>
+        <w:tc>
+          <w:tcPr>
+            <w:tcW w:type="dxa" w:w="3000"/>
+            <w:tcMar>
+              <w:top w:w="90" w:type="dxa"/>
+              <w:start w:w="120" w:type="dxa"/>
+              <w:bottom w:w="90" w:type="dxa"/>
+              <w:end w:w="120" w:type="dxa"/>
+            </w:tcMar>
+            <w:vAlign w:val="center"/>
+          </w:tcPr>
+          <w:p>
+            <w:pPr>
+              <w:spacing w:after="0"/>
+            </w:pPr>
+            <w:r>
+              <w:rPr>
+                <w:rFonts w:ascii="Segoe UI" w:hAnsi="Segoe UI"/>
+                <w:color w:val="0F172A"/>
+                <w:sz w:val="15"/>
+              </w:rPr>
+              <w:t>La cartera no tiene porcentaje definido o el pago fue revertido.</w:t>
+            </w:r>
+          </w:p>
+        </w:tc>
+        <w:tc>
+          <w:tcPr>
+            <w:tcW w:type="dxa" w:w="4160"/>
+            <w:tcMar>
+              <w:top w:w="90" w:type="dxa"/>
+              <w:start w:w="120" w:type="dxa"/>
+              <w:bottom w:w="90" w:type="dxa"/>
+              <w:end w:w="120" w:type="dxa"/>
+            </w:tcMar>
+            <w:vAlign w:val="center"/>
+          </w:tcPr>
+          <w:p>
+            <w:pPr>
+              <w:spacing w:after="0"/>
+            </w:pPr>
+            <w:r>
+              <w:rPr>
+                <w:rFonts w:ascii="Segoe UI" w:hAnsi="Segoe UI"/>
+                <w:color w:val="0F172A"/>
+                <w:sz w:val="15"/>
+              </w:rPr>
+              <w:t>Pida al Supervisor revisar el % Comisión en Administración de carteras.</w:t>
+            </w:r>
+          </w:p>
+        </w:tc>
+      </w:tr>
+      <w:tr>
+        <w:trPr>
+          <w:cantSplit/>
+        </w:trPr>
+        <w:tc>
+          <w:tcPr>
+            <w:tcW w:type="dxa" w:w="2200"/>
+            <w:shd w:fill="F8FAFC"/>
+            <w:tcMar>
+              <w:top w:w="90" w:type="dxa"/>
+              <w:start w:w="120" w:type="dxa"/>
+              <w:bottom w:w="90" w:type="dxa"/>
+              <w:end w:w="120" w:type="dxa"/>
+            </w:tcMar>
+            <w:vAlign w:val="center"/>
+          </w:tcPr>
+          <w:p>
+            <w:pPr>
+              <w:spacing w:after="0"/>
+            </w:pPr>
+            <w:r>
+              <w:rPr>
+                <w:rFonts w:ascii="Segoe UI" w:hAnsi="Segoe UI"/>
+                <w:color w:val="0F172A"/>
+                <w:sz w:val="15"/>
+              </w:rPr>
+              <w:t>La comisión bajó sin corte</w:t>
+            </w:r>
+          </w:p>
+        </w:tc>
+        <w:tc>
+          <w:tcPr>
+            <w:tcW w:type="dxa" w:w="3000"/>
+            <w:shd w:fill="F8FAFC"/>
+            <w:tcMar>
+              <w:top w:w="90" w:type="dxa"/>
+              <w:start w:w="120" w:type="dxa"/>
+              <w:bottom w:w="90" w:type="dxa"/>
+              <w:end w:w="120" w:type="dxa"/>
+            </w:tcMar>
+            <w:vAlign w:val="center"/>
+          </w:tcPr>
+          <w:p>
+            <w:pPr>
+              <w:spacing w:after="0"/>
+            </w:pPr>
+            <w:r>
+              <w:rPr>
+                <w:rFonts w:ascii="Segoe UI" w:hAnsi="Segoe UI"/>
+                <w:color w:val="0F172A"/>
+                <w:sz w:val="15"/>
+              </w:rPr>
+              <w:t>El Supervisor cambió el porcentaje de la cartera o revirtió un pago.</w:t>
+            </w:r>
+          </w:p>
+        </w:tc>
+        <w:tc>
+          <w:tcPr>
+            <w:tcW w:type="dxa" w:w="4160"/>
+            <w:shd w:fill="F8FAFC"/>
+            <w:tcMar>
+              <w:top w:w="90" w:type="dxa"/>
+              <w:start w:w="120" w:type="dxa"/>
+              <w:bottom w:w="90" w:type="dxa"/>
+              <w:end w:w="120" w:type="dxa"/>
+            </w:tcMar>
+            <w:vAlign w:val="center"/>
+          </w:tcPr>
+          <w:p>
+            <w:pPr>
+              <w:spacing w:after="0"/>
+            </w:pPr>
+            <w:r>
+              <w:rPr>
+                <w:rFonts w:ascii="Segoe UI" w:hAnsi="Segoe UI"/>
+                <w:color w:val="0F172A"/>
+                <w:sz w:val="15"/>
+              </w:rPr>
+              <w:t>Consulte con el Supervisor antes de rehacer cualquier registro.</w:t>
+            </w:r>
+          </w:p>
+        </w:tc>
+      </w:tr>
+      <w:tr>
+        <w:trPr>
+          <w:cantSplit/>
+        </w:trPr>
+        <w:tc>
+          <w:tcPr>
+            <w:tcW w:type="dxa" w:w="2200"/>
+            <w:tcMar>
+              <w:top w:w="90" w:type="dxa"/>
+              <w:start w:w="120" w:type="dxa"/>
+              <w:bottom w:w="90" w:type="dxa"/>
+              <w:end w:w="120" w:type="dxa"/>
+            </w:tcMar>
+            <w:vAlign w:val="center"/>
+          </w:tcPr>
+          <w:p>
+            <w:pPr>
+              <w:spacing w:after="0"/>
+            </w:pPr>
+            <w:r>
+              <w:rPr>
+                <w:rFonts w:ascii="Segoe UI" w:hAnsi="Segoe UI"/>
+                <w:color w:val="0F172A"/>
+                <w:sz w:val="15"/>
+              </w:rPr>
               <w:t>Gestión guardada sin conexión</w:t>
             </w:r>
           </w:p>
@@ -15618,6 +17359,118 @@
                 <w:color w:val="0F172A"/>
                 <w:sz w:val="17"/>
               </w:rPr>
+              <w:t>Comisión</w:t>
+            </w:r>
+          </w:p>
+        </w:tc>
+        <w:tc>
+          <w:tcPr>
+            <w:tcW w:type="dxa" w:w="7260"/>
+            <w:tcMar>
+              <w:top w:w="90" w:type="dxa"/>
+              <w:start w:w="120" w:type="dxa"/>
+              <w:bottom w:w="90" w:type="dxa"/>
+              <w:end w:w="120" w:type="dxa"/>
+            </w:tcMar>
+            <w:vAlign w:val="center"/>
+          </w:tcPr>
+          <w:p>
+            <w:pPr>
+              <w:spacing w:after="0"/>
+            </w:pPr>
+            <w:r>
+              <w:rPr>
+                <w:rFonts w:ascii="Segoe UI" w:hAnsi="Segoe UI"/>
+                <w:color w:val="0F172A"/>
+                <w:sz w:val="17"/>
+              </w:rPr>
+              <w:t>Monto que gana la ejecutiva por cada pago que registra, calculado como un porcentaje del pago según la cartera.</w:t>
+            </w:r>
+          </w:p>
+        </w:tc>
+      </w:tr>
+      <w:tr>
+        <w:trPr>
+          <w:cantSplit/>
+        </w:trPr>
+        <w:tc>
+          <w:tcPr>
+            <w:tcW w:type="dxa" w:w="2100"/>
+            <w:shd w:fill="F8FAFC"/>
+            <w:tcMar>
+              <w:top w:w="90" w:type="dxa"/>
+              <w:start w:w="120" w:type="dxa"/>
+              <w:bottom w:w="90" w:type="dxa"/>
+              <w:end w:w="120" w:type="dxa"/>
+            </w:tcMar>
+            <w:vAlign w:val="center"/>
+          </w:tcPr>
+          <w:p>
+            <w:pPr>
+              <w:spacing w:after="0"/>
+            </w:pPr>
+            <w:r>
+              <w:rPr>
+                <w:rFonts w:ascii="Segoe UI" w:hAnsi="Segoe UI"/>
+                <w:color w:val="0F172A"/>
+                <w:sz w:val="17"/>
+              </w:rPr>
+              <w:t>Corte de comisiones</w:t>
+            </w:r>
+          </w:p>
+        </w:tc>
+        <w:tc>
+          <w:tcPr>
+            <w:tcW w:type="dxa" w:w="7260"/>
+            <w:shd w:fill="F8FAFC"/>
+            <w:tcMar>
+              <w:top w:w="90" w:type="dxa"/>
+              <w:start w:w="120" w:type="dxa"/>
+              <w:bottom w:w="90" w:type="dxa"/>
+              <w:end w:w="120" w:type="dxa"/>
+            </w:tcMar>
+            <w:vAlign w:val="center"/>
+          </w:tcPr>
+          <w:p>
+            <w:pPr>
+              <w:spacing w:after="0"/>
+            </w:pPr>
+            <w:r>
+              <w:rPr>
+                <w:rFonts w:ascii="Segoe UI" w:hAnsi="Segoe UI"/>
+                <w:color w:val="0F172A"/>
+                <w:sz w:val="17"/>
+              </w:rPr>
+              <w:t>Acción del Supervisor que deja el acumulado en $0 tras pagarlo. No borra pagos ni gestiones.</w:t>
+            </w:r>
+          </w:p>
+        </w:tc>
+      </w:tr>
+      <w:tr>
+        <w:trPr>
+          <w:cantSplit/>
+        </w:trPr>
+        <w:tc>
+          <w:tcPr>
+            <w:tcW w:type="dxa" w:w="2100"/>
+            <w:tcMar>
+              <w:top w:w="90" w:type="dxa"/>
+              <w:start w:w="120" w:type="dxa"/>
+              <w:bottom w:w="90" w:type="dxa"/>
+              <w:end w:w="120" w:type="dxa"/>
+            </w:tcMar>
+            <w:vAlign w:val="center"/>
+          </w:tcPr>
+          <w:p>
+            <w:pPr>
+              <w:spacing w:after="0"/>
+            </w:pPr>
+            <w:r>
+              <w:rPr>
+                <w:rFonts w:ascii="Segoe UI" w:hAnsi="Segoe UI"/>
+                <w:color w:val="0F172A"/>
+                <w:sz w:val="17"/>
+              </w:rPr>
               <w:t>SIP</w:t>
             </w:r>
           </w:p>
@@ -16572,7 +18425,7 @@
                 <w:color w:val="0F172A"/>
                 <w:sz w:val="19"/>
               </w:rPr>
-              <w:t>Manual de Usuario Controlia Cobranzas, versión 1.0, preparado para la entrega de la aplicación en agosto de 2026.</w:t>
+              <w:t>Manual de Usuario Controlia Cobranzas, versión 1.3, preparado para la entrega de la aplicación en agosto de 2026.</w:t>
             </w:r>
           </w:p>
         </w:tc>

</xml_diff>